<commit_message>
Proofcheck Inn Trouble French: SIGNIFICANT (22 fixes)
Co-Authored-By: Claude Opus 5.5 <noreply@anthropic.com>
Claude-Session: https://claude.ai/code/session_012Cm8JxdqzjuttdUSdkQCUg
</commit_message>
<xml_diff>
--- a/translated/corrected/Inn Trouble - ASSEMBLED - FORMATTED_French.docx
+++ b/translated/corrected/Inn Trouble - ASSEMBLED - FORMATTED_French.docx
@@ -162,13 +162,13 @@
     <w:p/>
     <w:p>
       <w:r>
-        <w:t xml:space="preserve">Elle a poussé un petit cri, le bref et sec piaillement qui signifiait de se dépêcher, a secoué sa queue et s’est dandinée jusque sur le perron dès que j’ai eu ouvert la porte, comme si c’était elle qui m’attendait et non l’inverse.</w:t>
-      </w:r>
-    </w:p>
-    <w:p/>
-    <w:p>
-      <w:r>
-        <w:t xml:space="preserve">Le matin était pour moitié automne et pour moitié quelque chose de plus froid. C’est la première chose que j’ai remarquée en descendant les marches du perron avec le panier au bras. Les érables le long d’Evergreen Avenue avaient perdu le plus clair de leur or durant le week-end, et ce qui en restait s’abattait en petites rafales sèches à chaque changement de vent, s’égaillant sur le trottoir et s’amoncelant dans les caniveaux. Sous l’odeur de feuille sèche de l’automne finissant, il y avait dans l’air cette fraîcheur nette et mordante que je connaissais depuis longtemps. De la neige. Pas aujourd’hui, peut-être pas demain. Mais en route. Il était déjà tombé de la neige, la semaine où nous avions trouvé le chien de Martha, une dizaine de centimètres, mais une série de jours doux avait tout effacé, et personne en ville n’était encore prêt à croire à l’hiver. Il y avait des lumières orange dans les vitrines des magasins et des citrouilles sur chaque perron, et tous ceux que je connaissais s’affairaient autour de la fête d’Halloween.</w:t>
+        <w:t xml:space="preserve">Elle a poussé un petit cri, le bref et sec piaillement qui signifiait de se dépêcher, a secoué sa queue et s’est dandinée jusque sur le porche dès que j’ai eu ouvert la porte, comme si c’était elle qui m’attendait et non l’inverse.</w:t>
+      </w:r>
+    </w:p>
+    <w:p/>
+    <w:p>
+      <w:r>
+        <w:t xml:space="preserve">Le matin était pour moitié automne et pour moitié quelque chose de plus froid. C’est la première chose que j’ai remarquée en descendant les marches du porche avec le panier au bras. Les érables le long d’Evergreen Avenue avaient perdu le plus clair de leur or durant le week-end, et ce qui en restait s’abattait en petites rafales sèches à chaque changement de vent, s’égaillant sur le trottoir et s’amoncelant dans les caniveaux. Sous l’odeur de feuille sèche de l’automne finissant, il y avait dans l’air cette fraîcheur nette et mordante que je connaissais depuis longtemps. De la neige. Pas aujourd’hui, peut-être pas demain. Mais en route. Il était déjà tombé de la neige, la semaine où nous avions trouvé le chien de Martha, une dizaine de centimètres, mais une série de jours doux avait tout effacé, et personne en ville n’était encore prêt à croire à l’hiver. Il y avait des lumières orange dans les vitrines des magasins et des citrouilles sur chaque perron, et tous ceux que je connaissais s’affairaient autour de la fête d’Halloween.</w:t>
       </w:r>
     </w:p>
     <w:p/>
@@ -186,7 +186,7 @@
     <w:p/>
     <w:p>
       <w:r>
-        <w:t xml:space="preserve">Le Winter Wonderland Inn se dressait là où Evergreen Avenue s’élargissait vers le parc, une haute maison à pignons peinte dans le vert-gris doux d’un ciel d’hiver, dotée d’une véranda qui en enveloppait deux côtés telle une accolade jetée sur l’épaule d’un ami. On aurait dit qu’elle avait poussé là plutôt que d’avoir été construite. Fiona avait accroché une couronne à la porte d’entrée, et je me suis arrêtée au bas des marches pour l’admirer, comme à chacun de mes passages. C’était un gros cercle de conifères, dense et sombre, entrelacé d’un large ruban d’or et constellé de pommes de pin qu’elle avait dorées elle-même, avec un unique brin de morelle douce-amère pour rappeler l’orange de la saison.</w:t>
+        <w:t xml:space="preserve">Le Winter Wonderland Inn se dressait là où Evergreen Avenue s’élargissait vers le parc, une haute maison à pignons peinte dans le vert-gris doux d’un ciel d’hiver, dotée d’un porche qui en enveloppait deux côtés telle une accolade jetée sur l’épaule d’un ami. On aurait dit qu’elle avait poussé là plutôt que d’avoir été construite. Fiona avait accroché une couronne à la porte d’entrée, et je me suis arrêtée au bas des marches pour l’admirer, comme à chacun de mes passages. C’était un gros cercle de conifères, dense et sombre, entrelacé d’un large ruban d’or et constellé de pommes de pin qu’elle avait dorées elle-même, avec un unique brin de morelle douce-amère pour rappeler l’orange de la saison.</w:t>
       </w:r>
     </w:p>
     <w:p/>
@@ -432,13 +432,13 @@
     <w:p/>
     <w:p>
       <w:r>
-        <w:t xml:space="preserve">Elle m’a jeté un regard d’une trahison profonde et millénaire. Puis, parce qu’elle n’était pas dénuée de petitesse d’esprit, elle a bousculé la table de l’épaule en passant. Toute l’installation de cristal a oscillé. Une demi-douzaine de clients ont retenu leur souffle d’un même élan, la femme âgée au coin du feu s’est à moitié soulevée de son siège, et la coupe s’est redéposée d’aplomb. Je nous ai exfiltrées toutes les deux par la porte d’entrée sur le perron avant que mon abominable manchot ne pût parachever ce qu’elle avait entamé.</w:t>
-      </w:r>
-    </w:p>
-    <w:p/>
-    <w:p>
-      <w:r>
-        <w:t xml:space="preserve">Dehors, le froid a été un soulagement après l’atmosphère confinée et soucieuse du hall. Je suis restée un instant contre la rampe de la véranda pour me vider la tête. En bas, dans le parc, des hommes juchés sur des échelles accrochaient les guirlandes du festival entre les lampadaires, s’interpellant à grands cris. Un aboiement de chien retentissait quelque part à l’autre bout du parc, et le train a poussé son sifflet lointain en s’immobilisant en gare. Tout cela était d’une telle normalité que le malaise sur le visage de Fiona semblait par moments n’être qu’une pure vue de mon esprit.</w:t>
+        <w:t xml:space="preserve">Elle m’a jeté un regard d’une trahison profonde et millénaire. Puis, parce qu’elle n’était pas dénuée de petitesse d’esprit, elle a bousculé la table de l’épaule en passant. Toute l’installation de cristal a oscillé. Une demi-douzaine de clients ont retenu leur souffle d’un même élan, la femme âgée au coin du feu s’est à moitié soulevée de son siège, et la coupe s’est redéposée d’aplomb. Je nous ai exfiltrées toutes les deux par la porte d’entrée sur le porche avant que mon abominable manchot ne pût parachever ce qu’elle avait entamé.</w:t>
+      </w:r>
+    </w:p>
+    <w:p/>
+    <w:p>
+      <w:r>
+        <w:t xml:space="preserve">Dehors, le froid a été un soulagement après l’atmosphère confinée et soucieuse du hall. Je suis restée un instant contre la rampe du porche pour me vider la tête. En bas, dans le parc, des hommes juchés sur des échelles accrochaient les guirlandes du festival entre les lampadaires, s’interpellant à grands cris. Un aboiement de chien retentissait quelque part à l’autre bout du parc, et le train a poussé son sifflet lointain en s’immobilisant en gare. Tout cela était d’une telle normalité que le malaise sur le visage de Fiona semblait par moments n’être qu’une pure vue de mon esprit.</w:t>
       </w:r>
     </w:p>
     <w:p/>
@@ -665,7 +665,7 @@
     </w:p>
     <w:p>
       <w:r>
-        <w:t xml:space="preserve">« Des années. » Elle s’est essuyé les yeux du revers de la main, un geste d’enfant. « Je l’ai trouvée après la mort de maman. Il y avait un coffre dans le grenier, une vieille malle de voyage, fermé à clé, et la clé était dans les affaires de maman avec une étiquette portant son écriture où il était juste écrit </w:t>
+        <w:t xml:space="preserve">« Des années. » Elle s’est essuyé les yeux du revers de la main, un geste d’enfant. « Je l’ai trouvée après la mort de maman. Il y avait un coffre dans le grenier, un vieux coffre de voyage, fermé à clé, et la clé était dans les affaires de maman avec une étiquette portant son écriture où il était juste écrit </w:t>
       </w:r>
       <w:r>
         <w:rPr>
@@ -764,7 +764,7 @@
     </w:p>
     <w:p>
       <w:r>
-        <w:t xml:space="preserve">Quand enfin Pip et moi sommes sorties de l’auberge, le froid m’a coupé le souffle, et je suis restée un moment sur le perron, une main pressée à plat à l’endroit où le mot reposait plié contre mon manteau. Un vol vieux de cent ans, et voilà qu’une brave femme ne pouvait plus dormir à cause de cela. Et seulement deux endroits au monde d’où le secret avait pu fuiter, l’un d’eux étant une boîte que seule Fiona pouvait ouvrir.</w:t>
+        <w:t xml:space="preserve">Quand enfin Pip et moi sommes sorties de l’auberge, le froid m’a coupé le souffle, et je suis restée un moment sur le porche, une main pressée à plat à l’endroit où le mot reposait plié contre mon manteau. Un vol vieux de cent ans, et voilà qu’une brave femme ne pouvait plus dormir à cause de cela. Et seulement deux endroits au monde d’où le secret avait pu fuiter, l’un d’eux étant une boîte que seule Fiona pouvait ouvrir.</w:t>
       </w:r>
     </w:p>
     <w:p>
@@ -1754,7 +1754,7 @@
     </w:p>
     <w:p>
       <w:r>
-        <w:t xml:space="preserve">« Tu es plus courageuse que tu ne le penses, ai-je dit enfin. Tu as porté son secret toute seule pendant toutes ces années et tu n’as jamais permis qu’il te rende froide. L’auberge est toujours chaleureuse, Fiona. Après cent ans, un coffre verrouillé et une lettre de chantage, c’est toujours la maison la plus chaleureuse de la ville. Ce n’est pas rien. C’est tout ce qu’elle a construit, maintenu en vie par toi. »</w:t>
+        <w:t xml:space="preserve">« Tu es plus courageuse que tu ne le penses, ai-je dit enfin. Tu as porté son secret toute seule pendant toutes ces années et tu n’as jamais permis qu’il te rende froide. L’auberge est toujours chaleureuse, Fiona. Après cent ans, un coffre verrouillé et une note de chantage, c’est toujours la maison la plus chaleureuse de la ville. Ce n’est pas rien. C’est tout ce qu’elle a construit, maintenu en vie par toi. »</w:t>
       </w:r>
     </w:p>
     <w:p>
@@ -2618,7 +2618,7 @@
     <w:p/>
     <w:p>
       <w:r>
-        <w:t xml:space="preserve">Je suis restée un moment avec ça, comme j’étais restée avec les vingt dollars de Sam. Voilà un homme croulant sous les dettes, avec toutes les raisons du monde et toutes les opportunités par-dessus le marché. Sa riposte consistait à monter la garde toute la nuit sur le festival de la ville moyennant finance et à faire faire des fentes à des grands-mères à cinq heures et demie du matin. Jamal cumulait trois emplois pour s’extirper de son gouffre de manière honnête, éreintante, centimètre par centimètre, et cela ne collait pas avec une lettre de chantage réclamant un demi-million de dollars. L’arithmétique ne concordait pas. Si Jamal Washington avait le moindre moyen d’extorquer une pareille somme grâce à un secret, il ne réglerait pas son réveil sur cinq heures.</w:t>
+        <w:t xml:space="preserve">Je suis restée un moment avec ça, comme j’étais restée avec les vingt dollars de Sam. Voilà un homme croulant sous les dettes, avec toutes les raisons du monde et toutes les opportunités par-dessus le marché. Sa riposte consistait à monter la garde toute la nuit sur le festival de la ville moyennant finance et à faire faire des fentes à des grands-mères à cinq heures et demie du matin. Jamal cumulait trois emplois pour s’extirper de son gouffre de manière honnête, éreintante, centimètre par centimètre, et cela ne collait pas avec une note de chantage réclamant un demi-million de dollars. L’arithmétique ne concordait pas. Si Jamal Washington avait le moindre moyen d’extorquer une pareille somme grâce à un secret, il ne réglerait pas son réveil sur cinq heures.</w:t>
       </w:r>
     </w:p>
     <w:p/>
@@ -2743,7 +2743,7 @@
     <w:p/>
     <w:p>
       <w:r>
-        <w:t xml:space="preserve">Dans le parc, les ennuis étaient de la responsabilité de Bram. Prancer s’était échappée de son enclos pendant la nuit pour descendre en ville, et elle se tenait dans le bassin de la fontaine — que la municipalité coupait chaque mois d’octobre — enfoncée jusqu’aux paturons dans les feuilles mortes. Elle se tenait là, la tête haute, et refusait de bouger.</w:t>
+        <w:t xml:space="preserve">Dans le parc, les ennuis étaient de la responsabilité de Bram. Prancer s’était échappée du paddock pendant la nuit pour descendre en ville, et elle se tenait dans le bassin de la fontaine — que la municipalité coupait chaque mois d’octobre — enfoncée jusqu’aux paturons dans les feuilles mortes. Elle se tenait là, la tête haute, et refusait de bouger.</w:t>
       </w:r>
     </w:p>
     <w:p/>
@@ -3883,7 +3883,7 @@
     </w:p>
     <w:p>
       <w:r>
-        <w:t xml:space="preserve">Je suis restée immobile à la lueur de la lampe. Le vol de la broche et l’achat de l’auberge constituaient deux secrets distincts, gardés dans deux bâtiments différents. Theo détenait l’un d’eux. Il avait les archives, les lettres, la fiche de catalogue, le papier à en-tête. Il avait le vol. Mais la preuve que l’argent volé était devenu cette auberge tant aimée se trouvait à la mairie, dans les registres fonciers qu’une femme rigide et fatiguée m’avait juré, les yeux dans les yeux, ne jamais consulter.</w:t>
+        <w:t xml:space="preserve">Je suis restée immobile à la lueur de la lampe. Le vol de la broche et l’achat de l’auberge constituaient deux secrets distincts, gardés dans deux bâtiments différents. Theo détenait l’un d’eux. Il avait les archives, les lettres, la fiche de catalogue, le papier à en-tête. Il avait le secret du vol. Mais la preuve que l’argent volé était devenu cette auberge tant aimée se trouvait à la mairie, dans les registres fonciers qu’une femme rigide et fatiguée m’avait juré, les yeux dans les yeux, ne jamais consulter.</w:t>
       </w:r>
     </w:p>
     <w:p>
@@ -3997,7 +3997,7 @@
     <w:p/>
     <w:p>
       <w:r>
-        <w:t xml:space="preserve">Theo détenait le vol. Il l’avait trouvé dans les lettres de Blackburn, la broche, la pierre, le prêteur sur gages. Il l’avait répertorié de sa main soignée, le saphir en son cœur, et ensuite il avait soustrait ces lettres des dossiers en les déclarant disparues. Mais Theo, en train de couler, épié par toute la ville, jamais chez lui, n’aurait pas pu faire le reste. Il n’aurait pas pu confirmer que l’auberge avait été achetée avec cet argent, car cette preuve ne se trouvait pas dans son bâtiment. Et il n’aurait pas pu transporter les notes à travers la ville pour en déposer une sur un bureau bondé en plein jour de festival, car Theo Hussein n’aurait pas pu descendre Evergreen Avenue incognito pour sauver sa peau.</w:t>
+        <w:t xml:space="preserve">Theo détenait le secret du vol. Il l’avait trouvé dans les lettres de Blackburn, la broche, la pierre, le prêteur sur gages. Il l’avait répertorié de sa main soignée, le saphir en son cœur, et ensuite il avait soustrait ces lettres des dossiers en les déclarant disparues. Mais Theo, en train de couler, épié par toute la ville, jamais chez lui, n’aurait pas pu faire le reste. Il n’aurait pas pu confirmer que l’auberge avait été achetée avec cet argent, car cette preuve ne se trouvait pas dans son bâtiment. Et il n’aurait pas pu transporter les notes à travers la ville pour en déposer une sur un bureau bondé en plein jour de festival, car Theo Hussein n’aurait pas pu descendre Evergreen Avenue incognito pour sauver sa peau.</w:t>
       </w:r>
     </w:p>
     <w:p/>
@@ -4330,7 +4330,7 @@
     <w:p/>
     <w:p>
       <w:r>
-        <w:t xml:space="preserve">« Theo, ai-je dit. Les lettres de chantage envoyées à Fiona ont été écrites sur le papier à en-tête de la Société. Le papier vergé épais aux vergures marquées. Je l’ai comparé grain à grain avec une feuille de ton stock. » Il a tressailli, mais j’ai continué, d’une voix assurée. « Et elles décrivent la broche comme </w:t>
+        <w:t xml:space="preserve">« Theo, ai-je dit. Les notes de chantage envoyées à Fiona ont été écrites sur le papier à en-tête de la Société. Le papier vergé épais aux vergures marquées. Je l’ai comparé grain à grain avec une feuille de ton stock. » Il a tressailli, mais j’ai continué, d’une voix assurée. « Et elles décrivent la broche comme </w:t>
       </w:r>
       <w:r>
         <w:rPr>
@@ -4369,7 +4369,7 @@
     <w:p/>
     <w:p>
       <w:r>
-        <w:t xml:space="preserve">« Vera, ai-je dit. Theo détenait le vol. Mais les notes indiquaient que l’auberge avait été achetée avec l’argent de la broche, et cela ne figurait dans aucune lettre des Blackburn. C’est un registre foncier. Un acte de propriété. Et l’acte de propriété de cette auberge reposait hors de son tiroir dans votre panier de reclassement hier matin, manipulé, sur le bureau d’une femme qui m’avait affirmé deux fois qu’elle ne consulte jamais les archives dans son dos. » J’ai gardé la voix douce. « Il détenait le vol. Vous aviez l’acte. Et vous aviez les jambes, Vera. Il n’aurait pas pu traverser cette ville inaperçu pour tout l’or du monde, tout le monde connaît Theo, tout le monde l’arrête. Mais personne ne sourcille si la secrétaire du maire passe à l’auberge pendant le festival. Je vous ai croisée moi-même sur les marches ce matin-là, avec vos laissez-passer de stationnement. Il n’aurait pas pu le faire seul. Il avait besoin de quelqu’un capable de se mouvoir dans la ville sans être vu. C’était vous. »</w:t>
+        <w:t xml:space="preserve">« Vera, ai-je dit. Theo détenait le secret du vol. Mais les notes indiquaient que l’auberge avait été achetée avec l’argent de la broche, et cela ne figurait dans aucune lettre des Blackburn. C’est un registre foncier. Un acte de propriété. Et l’acte de propriété de cette auberge reposait hors de son tiroir dans votre panier de reclassement hier matin, manipulé, sur le bureau d’une femme qui m’avait affirmé deux fois qu’elle ne consulte jamais les archives dans son dos. » J’ai gardé la voix douce. « Il détenait le secret du vol. Vous aviez l’acte. Et vous aviez les jambes, Vera. Il n’aurait pas pu traverser cette ville inaperçu pour tout l’or du monde, tout le monde connaît Theo, tout le monde l’arrête. Mais personne ne sourcille si la secrétaire du maire passe à l’auberge pendant le festival. Je vous ai croisée moi-même sur les marches ce matin-là, avec vos laissez-passer de stationnement. Il n’aurait pas pu le faire seul. Il avait besoin de quelqu’un capable de se mouvoir dans la ville sans être vu. C’était vous. »</w:t>
       </w:r>
     </w:p>
     <w:p/>
@@ -4528,7 +4528,7 @@
     </w:p>
     <w:p>
       <w:r>
-        <w:t xml:space="preserve">Ils étaient au courant, bien sûr. Rien de tel ne restait secret à Frost Falls plus d’une matinée. Les polis et aimables Worthington avaient compris, à travers les rumeurs du festival et le silence de l’auberge, que la Société historique traversait de graves difficultés financières et que ces difficultés avaient poussé un homme intègre à commettre un acte répréhensible. M. Worthington m’a trouvée sur la véranda de l’auberge lors de leur dernier matin, sa femme à ses côtés dans son cachemire crème, son beau manteau posé sur le bras, et il est allé droit au but avec l’aisance d’un homme pour qui l’argent n’avait jamais été un sujet difficile à aborder.</w:t>
+        <w:t xml:space="preserve">Ils étaient au courant, bien sûr. Rien de tel ne restait secret à Frost Falls plus d’une matinée. Les polis et aimables Worthington avaient compris, à travers les rumeurs du festival et le silence de l’auberge, que la Société historique traversait de graves difficultés financières et que ces difficultés avaient poussé un homme intègre à commettre un acte répréhensible. M. Worthington m’a trouvée sur le porche de l’auberge lors de leur dernier matin, sa femme à ses côtés dans son cachemire crème, son beau manteau posé sur le bras, et il est allé droit au but avec l’aisance d’un homme pour qui l’argent n’avait jamais été un sujet difficile à aborder.</w:t>
       </w:r>
     </w:p>
     <w:p>
@@ -4543,7 +4543,7 @@
     </w:p>
     <w:p>
       <w:r>
-        <w:t xml:space="preserve">C’était une offre généreuse, dictée par un cœur sincère. Et cela aurait marché, d’une certaine façon. Un seul chèque, et les problèmes d’argent de la Société auraient disparu, ces mêmes problèmes qui avaient poussé Theo presque à la folie pour faire ce qu’il avait fait. Une partie de moi, debout et fatiguée sur cette froide véranda, avait envie de saisir cette offre à deux mains et de considérer l’affaire pliée.</w:t>
+        <w:t xml:space="preserve">C’était une offre généreuse, dictée par un cœur sincère. Et cela aurait marché, d’une certaine façon. Un seul chèque, et les problèmes d’argent de la Société auraient disparu, ces mêmes problèmes qui avaient poussé Theo presque à la folie pour faire ce qu’il avait fait. Une partie de moi, debout et fatiguée sur ce porche froid, avait envie de saisir cette offre à deux mains et de considérer l’affaire pliée.</w:t>
       </w:r>
     </w:p>
     <w:p>
@@ -4822,7 +4822,7 @@
     <w:p/>
     <w:p>
       <w:r>
-        <w:t xml:space="preserve">Un instant plus tard, Bram a déboulé en courant à travers le parc en tordant son bonnet, et derrière lui, bien sûr, est arrivé un renne. Dancer cette fois-ci, qui s’était encore échappée de son enclos pour suivre les lanternes jusqu’en ville. Elle s’est plantée au milieu du parc, le givre scintillant sur ses bois, contemplant le coffret de cuivre déterré avec un intérêt modéré et sans hâte, tandis que cent villageois écarquillaient les yeux et qu’une petite fille poussait un cri perçant de pure joie.</w:t>
+        <w:t xml:space="preserve">Un instant plus tard, Bram a déboulé en courant à travers le parc en tordant son bonnet, et derrière lui, bien sûr, est arrivé un renne. Dancer cette fois-ci, qui s’était encore échappée du paddock pour suivre les lanternes jusqu’en ville. Elle s’est plantée au milieu du parc, le givre scintillant sur ses bois, contemplant le coffret de cuivre déterré avec un intérêt modéré et sans hâte, tandis que cent villageois écarquillaient les yeux et qu’une petite fille poussait un cri perçant de pure joie.</w:t>
       </w:r>
     </w:p>
     <w:p/>
@@ -4840,7 +4840,7 @@
     <w:p/>
     <w:p>
       <w:r>
-        <w:t xml:space="preserve">Je suis restée là, dans le parc, à regarder tout cela : l’orme et les lumières dorées, le coffret de cuivre vert, le renne, l’enfant qui riait et toute la ville rassemblée tout près dans la lueur des lanternes. Pip était allée se placer juste sous le nez de Dancer et lui lançait un regard long et sévère, comme pour lui rappeler à qui appartenait ce manchot. La main de Nick a trouvé la mienne. Au-delà de l’enclos se trouvait le foyer qu’il avait bâti pour la magie, et je me demandais quelle part de plus de celle-ci y tournerait lorsque nous serions rentrés à la maison.</w:t>
+        <w:t xml:space="preserve">Je suis restée là, dans le parc, à regarder tout cela : l’orme et les lumières dorées, le coffret de cuivre vert, le renne, l’enfant qui riait et toute la ville rassemblée tout près dans la lueur des lanternes. Pip était allée se placer juste sous le nez de Dancer et lui lançait un regard long et sévère, comme pour lui rappeler à qui appartenait ce manchot. La main de Nick a trouvé la mienne. Au-delà du paddock se trouvait le foyer qu’il avait bâti pour la magie, et je me demandais quelle part de plus de celle-ci y tournerait lorsque nous serions rentrés à la maison.</w:t>
       </w:r>
     </w:p>
     <w:p/>
@@ -5196,7 +5196,7 @@
     <w:p/>
     <w:p>
       <w:r>
-        <w:t xml:space="preserve">Dot a poussé son petit rire sec de l’autre côté du cercle, sans lever les yeux de sa propre couronne, qui faisait déjà deux fois la taille de celle de n’importe qui d’autre et affichait une densité double. « Elle essaie de percer ton truc depuis le jour où tu as franchi la porte. Elle essayait de percer le mien en mil neuf cent quatre-vingt-quelque. » Dot était robuste, aux cheveux gris, et disait beaucoup de choses en très peu de mots. Elle confectionnait des couronnes dans cette boutique depuis des décennies. Cela se voyait dans ses mains. Elles ne s’arrêtaient jamais et ne rataient jamais rien.</w:t>
+        <w:t xml:space="preserve">Dot a poussé son petit rire sec de l’autre côté du cercle, sans lever les yeux de sa propre couronne, qui faisait déjà une fois et demie la taille de celle de n’importe qui d’autre et affichait une densité double. « Elle essaie de percer ton truc depuis le jour où tu as franchi la porte. Elle essayait de percer le mien en mil neuf cent quatre-vingt-quelque. » Dot était robuste, aux cheveux gris, et disait beaucoup de choses en très peu de mots. Elle confectionnait des couronnes dans cette boutique depuis des décennies. Cela se voyait dans ses mains. Elles ne s’arrêtaient jamais et ne rataient jamais rien.</w:t>
       </w:r>
     </w:p>
     <w:p/>
@@ -5280,7 +5280,7 @@
     <w:p/>
     <w:p>
       <w:r>
-        <w:t xml:space="preserve">« Quelqu’un doit bien le faire. Vous n’allez pas le faire pour vous-mêmes. » Elle soulevait déjà le couvercle. L’odeur s’est échappée pour se mêler au sapin baumier au milieu de la pièce, du chocolat, des pacanes et de la cassonade nappant les aiguilles de pin froides et vertes. C’était, me suis-je dit, ce qui s’approchait le plus du parfum de toute la saison à venir que je connaisse. « Et il y a des biscuits au gingembre au fond, alors faites attention à ne pas prendre seulement les cupcakes en laissant les biscuits, Dot, je t’ai vue le faire aux réunions de la Grange et je ne l’ai pas oublié. »</w:t>
+        <w:t xml:space="preserve">« Quelqu’un doit bien le faire. Vous n’allez pas le faire pour vous-mêmes. » Elle soulevait déjà le couvercle. L’odeur s’est échappée pour se mêler au sapin baumier au milieu de la pièce, du chocolat, des pacanes et de la cassonade nappant les aiguilles de pin froides et vertes. C’était, me suis-je dit, ce qui s’approchait le plus du parfum de toute la saison à venir que je connaisse. « Et il y a des biscuits au gingembre au fond, alors faites attention à ne pas prendre seulement les cupcakes en laissant les biscuits, Dot, je t’ai vue le faire à la Grange et je ne l’ai pas oublié. »</w:t>
       </w:r>
     </w:p>
     <w:p/>
@@ -5382,7 +5382,7 @@
     <w:p/>
     <w:p>
       <w:r>
-        <w:t xml:space="preserve">Le parc s’étendait en face de Yarn Tales, une large étendue communale toute blanche dotée d’un kiosque à musique à une extrémité et d’un monument aux morts à l’autre. Les écoliers y avaient bâti une rangée de bonhommes de neige lors de la première vraie chute de neige. Trois spécimens, replets, de travers et coiffés de tout ce que les gamins avaient pu dégoter. Hier, comme le disait Ellie, ils tournaient le dos aux façades pour faire face à la route, les yeux en charbon et l’air jovial, observant le trafic passer comme le font les bonhommes de neige. J’étais passée devant moi-même la veille au soir. Ils faisaient face à la rue.</w:t>
+        <w:t xml:space="preserve">Le parc s’étendait en face de Yarn Tales, une large étendue communale toute blanche dotée d’un kiosque à musique à une extrémité et d’un monument aux morts à l’autre. Les écoliers y avaient bâti une rangée de bonhommes de neige lors de la première vraie chute de neige. Trois spécimens, replets, de travers et coiffés de tout ce que les gamins avaient pu dégoter. Hier, comme le disait Ellie, ils faisaient face à la route, les yeux en charbon et l’air jovial, observant le trafic passer comme le font les bonhommes de neige. J’étais passée devant moi-même la veille au soir. Ils faisaient face à la rue.</w:t>
       </w:r>
     </w:p>
     <w:p/>

</xml_diff>

<commit_message>
Full proofcheck Inn Trouble French: SIGNIFICANT (64 edits)
Co-Authored-By: Claude Opus 5.5 <noreply@anthropic.com>
Claude-Session: https://claude.ai/code/session_012Cm8JxdqzjuttdUSdkQCUg
</commit_message>
<xml_diff>
--- a/translated/corrected/Inn Trouble - ASSEMBLED - FORMATTED_French.docx
+++ b/translated/corrected/Inn Trouble - ASSEMBLED - FORMATTED_French.docx
@@ -121,7 +121,7 @@
     <w:p/>
     <w:p>
       <w:r>
-        <w:t xml:space="preserve">Le mot exige un demi-million de dollars. Il sait ce que son arrière-grand-mère a pris aux Blackburn en 1924, et dans quelle boutique, à deux bourgades de là, elle l’a vendu, et il nomme le saphir au cœur de la broche — des détails qui n’existent que dans un seul coffre verrouillé, dans le grenier de Fiona, et en un seul autre endroit en ville.</w:t>
+        <w:t xml:space="preserve">Le mot exige un demi-million de dollars. Il sait ce que son arrière-grand-mère a pris aux Blackburn en 1924, et dans quelle boutique, à deux bourgades de là, elle l’a vendu, et il nomme la pierre au cœur de la broche — des détails qui n’existent que dans un seul coffre verrouillé, dans le grenier de Fiona, et en un seul autre endroit en ville.</w:t>
       </w:r>
     </w:p>
     <w:p/>
@@ -222,7 +222,7 @@
     <w:p/>
     <w:p>
       <w:r>
-        <w:t xml:space="preserve">Elle se tenait derrière le comptoir de réception, faisant tourner un stylo de bout en bout. Fiona était une femme taillée pour la bonne humeur. Elle était ronde et vive, prompte à bouger et plus prompte encore à rire, d’un rire qui prenait sa source au plus profond pour jaillir d’un seul coup. La joie s’était évaporée d’elle telle la chaleur d’une pièce dont on laisse la porte ouverte. Des cernes ombrageaient ses yeux que la poudre n’avait point masqués. Son gilet était boutonné de travers d’un cran. Quand elle m’a aperçue, elle a fait ce geste qui m’a troublée plus encore que ses cernes : elle a arrangé son visage. Elle a enfilé l’accueil, délibérément, à la manière d’une femme qui passe un manteau trop lourd pour ses épaules, et est venue à ma rencontre en contournant le bureau.</w:t>
+        <w:t xml:space="preserve">Elle se tenait derrière le comptoir de réception, faisant tourner un stylo de bout en bout. Fiona était une femme taillée pour la bonne humeur. Elle était ronde et vive, prompte à bouger et plus prompte encore à rire, d’un rire qui prenait sa source au plus profond pour jaillir d’un seul coup. La joie s’était évaporée d’elle telle la chaleur d’une pièce dont on laisse la porte ouverte. Des cernes ombrageaient ses yeux que la poudre n’avait pas masqués. Son gilet était boutonné de travers d’un cran. Quand elle m’a aperçue, elle a fait ce geste qui m’a troublée plus encore que ses cernes : elle a arrangé son visage. Elle a enfilé l’accueil, délibérément, à la manière d’une femme qui passe un manteau trop lourd pour ses épaules, et est venue à ma rencontre en contournant le bureau.</w:t>
       </w:r>
     </w:p>
     <w:p/>
@@ -240,7 +240,7 @@
     <w:p/>
     <w:p>
       <w:r>
-        <w:t xml:space="preserve">Cela a arraché un demi-sourire, ce qui était déjà ça. Elle a pris le panier et l’a serré contre elle des deux bras, pareille à un enfant serrant une bouillote brûlante. Par-dessus, son regard a glissé par-dessus mon épaule vers la porte, est revenu, puis est reparti. Elle surveillait l’entrée. Je connaissais ce regard. J’ai lu dans ma vie bon nombre de lettres émanant de personnes qui passent leurs journées à guetter une porte pour y voir surgir ce qu’elles redoutent, et ce regard finit par s’inscrire dans les corps avec le temps. Il habitait désormais celui de Fiona.</w:t>
+        <w:t xml:space="preserve">Cela a arraché un demi-sourire, ce qui était déjà ça. Elle a pris le panier et l’a serré contre elle des deux bras, pareille à un enfant serrant une bouillote brûlante. Par-dessus le panier, son regard a glissé au-delà de mon épaule vers la porte, est revenu, puis est reparti. Elle surveillait l’entrée. Je connaissais ce regard. J’ai lu dans ma vie bon nombre de lettres émanant de personnes qui passent leurs journées à guetter une porte pour y voir surgir ce qu’elles redoutent, et ce regard finit par s’inscrire dans les corps avec le temps. Il habitait désormais celui de Fiona.</w:t>
       </w:r>
     </w:p>
     <w:p/>
@@ -306,7 +306,7 @@
     <w:p/>
     <w:p>
       <w:r>
-        <w:t xml:space="preserve">C’était Sam Patel cette fois, qui reculait en portant une caisse de fer forgé dans ses bras, les ferrures de porche résonnant sourdement l’une contre l’autre lorsqu’il a pivoté pour les déposer près du comptoir dans un grognement. Sam était un homme robuste et précautionneux, la suie incrustée si profondément dans les plis de ses jointures que je doutais qu’aucun savon pût jamais l’en déloger, et d’ordinaire, il affichait cette zénitude tranquille propre aux artisans. Il n’en restait rien. Il a rejoint Fiona, la mâchoire serrée.</w:t>
+        <w:t xml:space="preserve">C’était Sam Patel cette fois, qui reculait en portant une caisse de fer forgé dans ses bras, les consoles de porche résonnant sourdement l’une contre l’autre lorsqu’il a pivoté pour les déposer près du comptoir dans un grognement. Sam était un homme robuste et précautionneux, la suie incrustée si profondément dans les plis de ses jointures que je doutais qu’aucun savon pût jamais l’en déloger, et d’ordinaire, il affichait ce calme tranquille propre aux artisans. Il n’en restait rien. Il a rejoint Fiona, la mâchoire serrée.</w:t>
       </w:r>
     </w:p>
     <w:p/>
@@ -438,7 +438,7 @@
     <w:p/>
     <w:p>
       <w:r>
-        <w:t xml:space="preserve">Dehors, le froid a été un soulagement après l’atmosphère confinée et soucieuse du hall. Je suis restée un instant contre la rampe du porche pour me vider la tête. En bas, dans le parc, des hommes juchés sur des échelles accrochaient les guirlandes du festival entre les lampadaires, s’interpellant à grands cris. Un aboiement de chien retentissait quelque part à l’autre bout du parc, et le train a poussé son sifflet lointain en s’immobilisant en gare. Tout cela était d’une telle normalité que le malaise sur le visage de Fiona semblait par moments n’être qu’une pure vue de mon esprit.</w:t>
+        <w:t xml:space="preserve">Dehors, le froid a été un soulagement après l’atmosphère confinée et soucieuse du hall. Je suis restée un instant contre la rampe du porche pour me vider la tête. En bas, dans le parc, des hommes juchés sur des échelles accrochaient les guirlandes du festival entre les lampadaires, s’interpellant à grands cris. Un aboiement de chien retentissait quelque part à l’autre bout du parc, et le train a poussé son sifflet lointain en s’immobilisant en gare. Tout cela était d’une telle normalité que le malaise sur le visage de Fiona a semblé un instant n’être qu’une pure vue de mon esprit.</w:t>
       </w:r>
     </w:p>
     <w:p/>
@@ -474,7 +474,7 @@
     <w:p/>
     <w:p>
       <w:r>
-        <w:t xml:space="preserve">Ce n’était rien. Un faux contact. Un tour joué par le froid à des yeux fatigués. Je me le suis répété tout du long en remontant Evergreen Avenue, dépassant la boulangerie dont le pain matinal embaumait tout le pâté de maisons, dépassant le parc et ses lumières à moitié tendues, dépassant le squelette lecteur de journaux de la Gazette. Un fil desserré. Rien de plus.</w:t>
+        <w:t xml:space="preserve">Ce n’était rien. Un faux contact. Un tour joué par le froid à des yeux fatigués. Je me le suis répété tout du long en remontant Evergreen Avenue, dépassant la boulangerie dont le pain matinal embaumait tout le pâté de maisons, dépassant le parc et ses lumières à moitié tendues, dépassant le squelette lecteur de journaux de la Gazette. Un faux contact. Rien de plus.</w:t>
       </w:r>
     </w:p>
     <w:p/>
@@ -498,7 +498,7 @@
     <w:p/>
     <w:p>
       <w:r>
-        <w:t xml:space="preserve">Elle a piaillé, impénitente. Nous sommes rentrées par ce matin doré et frais, et je n’ai point tourné la tête pour contempler les corniches de l’auberge, bien qu’une part de moi brûlât de savoir si les lumières y restaient orange ou avaient repris, en douce, leur éclat doré tandis que je tournais le dos.</w:t>
+        <w:t xml:space="preserve">Elle a piaillé, impénitente. Nous sommes rentrées par ce matin doré et frais, et je n’ai pas tourné la tête pour contempler les corniches de l’auberge, bien qu’une part de moi brûlât de savoir si les lumières y restaient orange ou avaient repris, en douce, leur éclat doré tandis que je tournais le dos.</w:t>
       </w:r>
     </w:p>
     <w:p>
@@ -594,7 +594,7 @@
     </w:p>
     <w:p>
       <w:r>
-        <w:t xml:space="preserve">C’était un mot. L’écriture était délibérément mauvaise, pleine de traits inégaux et de lettres cassées, cette maladresse artificielle que l’on prend soin d’adopter quand on s’efforce de dissimuler son écriture. La somme a été la première chose que j’ai vue, parce que quiconque l’avait écrite avait voulu que la somme soit la première chose que l’on voie. Cinq cent mille dollars. Et en dessous, dans cette même écriture laborieuse, le reste. </w:t>
+        <w:t xml:space="preserve">C’était un mot. L’écriture était délibérément mauvaise, pleine de traits inégaux et de lettres cassées, cette maladresse artificielle que l’on prend soin d’adopter quand on s’efforce de dissimuler son écriture. La somme a été la première chose que j’ai vue, parce que quiconque l’avait écrit avait voulu que la somme soit la première chose que l’on voie. Cinq cent mille dollars. Et en dessous, dans cette même écriture laborieuse, le reste. </w:t>
       </w:r>
       <w:r>
         <w:rPr>
@@ -709,7 +709,7 @@
     </w:p>
     <w:p>
       <w:r>
-        <w:t xml:space="preserve">« Alors réfléchis un instant avec moi, ai-je dit, parce que c’est plus important que tout. Quiconque a écrit ce mot sait ce qu’il y avait dans ce coffre verrouillé. Et il n’y a que deux façons pour quelqu’un de savoir ce que contient une boîte fermée à clé que toi seule as ouverte. Soit cette personne est parvenue d’une manière ou d’une autre à s’introduire dans ton coffre, ce qui, d’après toi, est impossible. » J’ai levé un doigt. « Soit elle est parvenue au même secret par l’autre côté. Du côté des Blackburn. Parce que les Blackburn ont bien perdu une broche en 1924, n’est-ce pas ? Une famille pareille, ils ont dû l’écrire. Une lettre, des comptes de maison, un mot pour l’assureur, n’importe quoi. Leur version de l’histoire existe quelque part, indépendamment de la tienne. »</w:t>
+        <w:t xml:space="preserve">« Alors réfléchis un instant avec moi, ai-je dit, parce que c’est plus important que tout. Quiconque a écrit ce mot sait ce qu’il y avait dans ce coffre verrouillé. Et il n’y a que deux façons pour quelqu’un de savoir ce que contient un coffre fermé à clé que toi seule as ouvert. Soit cette personne est parvenue d’une manière ou d’une autre à s’introduire dans ton coffre, ce qui, d’après toi, est impossible. » J’ai levé un doigt. « Soit elle est parvenue au même secret par l’autre côté. Du côté des Blackburn. Parce que les Blackburn ont bien perdu une broche en 1924, n’est-ce pas ? Une famille pareille, ils ont dû l’écrire. Une lettre, des comptes de maison, un mot pour l’assureur, n’importe quoi. Leur version de l’histoire existe quelque part, indépendamment de la tienne. »</w:t>
       </w:r>
     </w:p>
     <w:p>
@@ -892,7 +892,7 @@
     <w:p/>
     <w:p>
       <w:r>
-        <w:t xml:space="preserve">Pip s’est réveillée au grincement de la casserole et est venue s’approcher de la table dans l’espoir d’obtenir une sardine, ce qui constituait son droit le plus ancien et inaliénable. La cuisine s’est réchauffée. Pendant un petit moment, nous n’étions que tous les deux, le feu et la buée sur la fenêtre, et j’ai laissé le temps suspendu à cela.</w:t>
+        <w:t xml:space="preserve">Pip s’est réveillée au grincement de la casserole et est venue s’approcher de la table dans l’espoir d’obtenir une sardine, ce qui constituait son droit le plus ancien et inaliénable. La cuisine s’est réchauffée. Pendant un petit moment, nous n’étions que tous les deux, le feu et la buée sur la fenêtre, et je n’en ai pas demandé davantage.</w:t>
       </w:r>
     </w:p>
     <w:p/>
@@ -1100,7 +1100,7 @@
     </w:p>
     <w:p>
       <w:r>
-        <w:t>Et il y avait beaucoup à regarder, car ils étaient tous là. Chacun d’eux, ai-je noté, dans le même bâtiment avec les boîtes des Blackburn à portée de main, par ce même matin lumineux.</w:t>
+        <w:t xml:space="preserve">Et il y avait beaucoup à regarder, car ils étaient tous là. Chacun d’eux, ai-je noté, dans le même bâtiment avec les cartons des Blackburn à portée de main, par ce même matin lumineux.</w:t>
       </w:r>
     </w:p>
     <w:p>
@@ -1302,7 +1302,7 @@
     </w:p>
     <w:p>
       <w:r>
-        <w:t xml:space="preserve">« Il ne dort pas », a dit Martha, et la platitude de sa voix a fait lever les yeux à tout le monde. Martha avait enseigné dans cette ville pendant quarante ans, et elle avait une façon de poser un fait brut sur la table pour que chacun puisse le voir, clairement, sans fioritures. « Je lui ai apporté un gratin mardi soir. La porte n’était pas fermée à clé, alors je suis entrée, et je l’ai trouvé endormi à son bureau au fond, avec ses lunettes encore sur le nez et, à côté de lui, un sandwich durci qu’il n’avait jamais touché. Je n’ai pas eu le cœur de le réveiller. J’ai posé le gratin et un mot, puis je me suis éclipsée. » Elle a repris une maille. « Il vit là-bas. Dans ce bâtiment. Il a arrêté de rentrer chez lui. »</w:t>
+        <w:t xml:space="preserve">« Il ne dort pas », a dit Martha, et le ton monocorde de sa voix a fait lever les yeux à tout le monde. Martha avait enseigné dans cette ville pendant quarante ans, et elle avait une façon de poser un fait brut sur la table pour que chacun puisse le voir, clairement, sans fioritures. « Je lui ai apporté un gratin mardi soir. La porte n’était pas fermée à clé, alors je suis entrée, et je l’ai trouvé endormi à son bureau au fond, avec ses lunettes encore sur le nez et, à côté de lui, un sandwich durci qu’il n’avait jamais touché. Je n’ai pas eu le cœur de le réveiller. J’ai posé le gratin et un mot, puis je me suis éclipsée. » Elle a repris une maille. « Il vit là-bas. Dans ce bâtiment. Il a arrêté de rentrer chez lui. »</w:t>
       </w:r>
     </w:p>
     <w:p>
@@ -1337,7 +1337,7 @@
     </w:p>
     <w:p>
       <w:r>
-        <w:t xml:space="preserve">Je le soupçonnais. Un homme aussi désespéré, qui avait passé ses nuits seul parmi les boîtes des Blackburn, qui s’était dressé devant toute la ville pour déclarer que les lettres les plus intéressantes s’étaient égarées. Je voulais en avoir le cœur net, et je me suis forcée à attendre.</w:t>
+        <w:t xml:space="preserve">Je le soupçonnais. Un homme aussi désespéré, qui avait passé ses nuits seul parmi les cartons des Blackburn, qui s’était dressé devant toute la ville pour déclarer que les lettres les plus intéressantes s’étaient égarées. Je voulais en avoir le cœur net, et je me suis forcée à attendre.</w:t>
       </w:r>
     </w:p>
     <w:p>
@@ -1362,7 +1362,7 @@
     </w:p>
     <w:p>
       <w:r>
-        <w:t xml:space="preserve">La conversation a ensuite bifurqué vers les moufles, le nouveau bébé de la fille d’Ivy, et sur la question de savoir si une neige de début octobre annonçait un hiver rude ou doux, ce que personne n’a tranché. J’ai laissé la conversation filer. À côté de moi, Martha s’était tue sur son ouvrage. Au bout d’un moment, elle s’est penchée un peu vers moi et a murmuré, à voix basse, juste pour nous deux : « Et comment va notre Fiona ? J’ai entendu dire qu’elle n’était pas dans son assiette. »</w:t>
+        <w:t xml:space="preserve">La conversation a ensuite bifurqué vers les moufles, le nouveau bébé de la fille d’Ivy, et sur la question de savoir si une première neige en octobre annonçait un hiver rude ou doux, ce que personne n’a tranché. J’ai laissé la conversation filer. À côté de moi, Martha s’était tue sur son ouvrage. Au bout d’un moment, elle s’est penchée un peu vers moi et a murmuré, à voix basse, juste pour nous deux : « Et comment va notre Fiona ? J’ai entendu dire qu’elle n’était pas dans son assiette. »</w:t>
       </w:r>
     </w:p>
     <w:p>
@@ -1433,7 +1433,7 @@
     </w:p>
     <w:p>
       <w:r>
-        <w:t xml:space="preserve">Le parc était l’endroit où le festival allait avoir lieu, le grand pré communal au sud d’Evergreen qui descendait depuis la place, avec le monument aux morts tout en haut et le grand orme à l’autre bout. Toute la ville s’était mobilisée pour l’habiller. Il y avait des tables tréteaux à porter et à aligner en rangées, une estrade à monter à l’extrémité nord, et ce qui ressemblait à un millier de petits cucurbitacés à arranger pour leur donner un air faussement négligé. En réalité, un comité allait le peaufiner pendant une heure. J’étais venue seulement pour déposer la première douzaine de moufles du cercle auprès du comité du festival, et quatre-vingt-dix secondes après mon arrivée, un homme que je ne connaissais pas m’avait fourré dans les bras une caisse de citrouilles à tarte en me disant : « Vous me poseriez ça le long de l’estrade, s’il vous plaît ? Faites attention à celle qui est molle. » C’était comme ça que les choses se passaient dans cette ville, et cela ne me dérangeait pas le moins du monde. Il n’y avait pas de place pour les réflexions avec une caisse de citrouilles dans les bras, et cela m’allait très bien.</w:t>
+        <w:t xml:space="preserve">Le parc était l’endroit où le festival allait avoir lieu, le grand pré communal au sud d’Evergreen qui descendait depuis la place, avec le monument aux morts tout en haut et le grand orme à l’autre bout. Toute la ville s’était mobilisée pour l’habiller. Il y avait des tables tréteaux à porter et à aligner en rangées, une estrade à monter à l’extrémité nord, et ce qui ressemblait à un millier de petites cucurbitacées à arranger pour leur donner un air faussement négligé. En réalité, un comité allait le peaufiner pendant une heure. J’étais venue seulement pour déposer la première douzaine de moufles du cercle auprès du comité du festival, et quatre-vingt-dix secondes après mon arrivée, un homme que je ne connaissais pas m’avait fourré dans les bras une caisse de citrouilles à tarte en me disant : « Vous me poseriez ça le long de l’estrade, s’il vous plaît ? Faites attention à celle qui est molle. » C’était comme ça que les choses se passaient dans cette ville, et cela ne me dérangeait pas le moins du monde. Il n’y avait pas de place pour les réflexions avec une caisse de citrouilles dans les bras, et cela m’allait très bien.</w:t>
       </w:r>
     </w:p>
     <w:p>
@@ -1443,7 +1443,7 @@
     </w:p>
     <w:p>
       <w:r>
-        <w:t xml:space="preserve">Je me suis retournée. Pip avait la tête entièrement enfoncée dans le couvercle arraché d’une lanterne d’Halloween que quelqu’un avait sculptée plus tôt, extrayant les graines humides et les jetant sur l’herbe avec la félicité exclusive qu’elle réservait à tout ce qui était défendu. Penchée au-dessus d’elle, partagée entre l’horreur et le ravissement, se trouvait Emma Redfern.</w:t>
+        <w:t xml:space="preserve">Je me suis retournée. Pip avait la tête entièrement enfoncée dans le haut éventré d’une lanterne d’Halloween que quelqu’un avait sculptée plus tôt, extrayant les graines humides et les jetant sur l’herbe avec la félicité exclusive qu’elle réservait à tout ce qui était défendu. Penchée au-dessus d’elle, partagée entre l’horreur et le ravissement, se trouvait Emma Redfern.</w:t>
       </w:r>
     </w:p>
     <w:p>
@@ -1503,7 +1503,7 @@
     </w:p>
     <w:p>
       <w:r>
-        <w:t>Nous nous sommes mis au travail ensemble après cela, tous les quatre et le chien, à porter des chaises, à convoyer des cucurbitacés et à discuter amicalement pour savoir quelles citrouilles étaient trop molles pour le premier rang.</w:t>
+        <w:t xml:space="preserve">Nous nous sommes mis au travail ensemble après cela, tous les quatre et le chien, à porter des chaises, à convoyer des cucurbitacées et à discuter amicalement pour savoir quelles citrouilles étaient trop molles pour le premier rang.</w:t>
       </w:r>
     </w:p>
     <w:p>
@@ -1518,7 +1518,7 @@
     </w:p>
     <w:p>
       <w:r>
-        <w:t xml:space="preserve">« Comment ça va, Mark ? » lui ai-je demandé à voix basse, la fois suivante où nous nous sommes croisés, pendant qu’Emma négociait une paix fragile entre Snowball et une citrouille qui l’avait offensé.</w:t>
+        <w:t xml:space="preserve">« Comment ça va, Mark ? » lui ai-je demandé à voix basse, la fois suivante où nous nous sommes croisés, pendant qu’Emma négociait une paix fragile entre Snowball et une cucurbitacée qui l’avait offensé.</w:t>
       </w:r>
     </w:p>
     <w:p>
@@ -1633,7 +1633,7 @@
     </w:p>
     <w:p>
       <w:r>
-        <w:t xml:space="preserve">« Ce n’est pas moi qui ai fait ça », ai-je dit, et c’était vrai. « Mais je crois que c’est un truc de Noël quand même. Autour de chez nous, Noël arrive en avance parfois. »</w:t>
+        <w:t xml:space="preserve">« Ce n’est pas moi qui ai fait ça », ai-je dit, et c’était vrai. « Mais je crois que c’est un truc de Noël quand même. Chez nous, Noël arrive en avance parfois. »</w:t>
       </w:r>
     </w:p>
     <w:p>
@@ -1719,7 +1719,7 @@
     </w:p>
     <w:p>
       <w:r>
-        <w:t xml:space="preserve">Nous avons emporté la soupe dans le petit salon, elle a mangé, et je l’ai regardée manger. J’avais appris depuis longtemps qu’on peut deviner beaucoup de l’état d’une personne selon qu’elle se rappelle ou non le goût de sa nourriture. Fiona avait cessé de goûter la sienne, quelque part au cours des dernières semaines. Elle a mangé la première moitié du bol comme un médicament, vite et machinalement. Puis, vers le milieu, elle a ralenti et a savouré. Ses épaules se sont relâchées d’un cran, et j’ai su que la soupe l’aidait.</w:t>
+        <w:t xml:space="preserve">Nous avons emporté la soupe dans le petit salon, elle a mangé, et je l’ai regardée manger. J’avais appris depuis longtemps qu’on peut deviner beaucoup de l’état d’une personne selon qu’elle pense ou non à goûter ce qu’elle mange. Fiona avait cessé de goûter la sienne, quelque part au cours des dernières semaines. Elle a mangé la première moitié du bol comme un médicament, vite et machinalement. Puis, vers le milieu, elle a ralenti et a savouré. Ses épaules se sont relâchées d’un cran, et j’ai su que la soupe l’aidait.</w:t>
       </w:r>
     </w:p>
     <w:p>
@@ -1867,7 +1867,7 @@
     <w:p/>
     <w:p>
       <w:r>
-        <w:t xml:space="preserve">Je l’ai observé pendant qu’il parlait. J’ai passé une longue vie à apprendre à distinguer les hommes qui savent exprimer un sentiment de ceux qui n’ont qu’un seul visage, et Sam Patel me parlant de vingt dollars était un homme à un seul visage, toute sa blessure étalée à la surface où la lueur du feu venait la capturer. Sa colère était une colère d’ami, faite surtout de peine, dépourvue de tout le calcul glacial d’un maître chanteur.</w:t>
+        <w:t xml:space="preserve">Je l’ai observé pendant qu’il parlait. J’ai passé une longue vie à apprendre à distinguer les hommes qui savent porter un sentiment comme un masque de ceux qui n’ont qu’un seul visage, et Sam Patel me parlant de vingt dollars était un homme à un seul visage, toute sa blessure étalée à la surface où la lueur du feu venait la capturer. Sa colère était une colère d’ami, faite surtout de peine, dépourvue de tout le calcul glacial d’un maître chanteur.</w:t>
       </w:r>
     </w:p>
     <w:p/>
@@ -2094,7 +2094,7 @@
     <w:p/>
     <w:p>
       <w:r>
-        <w:t xml:space="preserve">Je suis allée à la bibliothèque pour lire des choses sur les Blackburn et j’y ai trouvé à la place un homme si bruyant et si éhontément curieux au sujet de la broche qu’il s’était presque disculpé par la seule envergure de son appétit pour celle-ci. Presque. Je n’étais pas prête à l’écarter totalement. Mais plus je m’attardais en sa compagnie, et moins Neil Carter ressemblait à un individu opérant dans l’ombre.</w:t>
+        <w:t xml:space="preserve">J’étais allée à la bibliothèque pour lire des choses sur les Blackburn et j’y avais trouvé à la place un homme si bruyant et si éhontément curieux au sujet de la broche qu’il s’était presque disculpé par la seule envergure de son appétit pour celle-ci. Presque. Je n’étais pas prête à l’écarter totalement. Mais plus je m’attardais en sa compagnie, et moins Neil Carter ressemblait à un individu opérant dans l’ombre.</w:t>
       </w:r>
     </w:p>
     <w:p/>
@@ -2117,7 +2117,7 @@
     <w:p/>
     <w:p>
       <w:r>
-        <w:t xml:space="preserve">« Madame Claus ! » Bram a fait le tour du chalet au trot, en tordant son bonnet entre ses mains. Bram était l’elfe qui était descendu dans le Sud avec nous, le contremaître de l’atelier relocalisé, dévoué, tatillon et bâti selon les proportions générales d’une patate inquiète, et il était au summum de l’angoisse à présent. « C’est Dancer. Elle s’est échappée encore une fois. C’est la troisième fois cette semaine, madame Claus, la troisième. Et je jurerais sur chaque bouton de ma veste que ce loquet était fermé quand je l’ai laissé, fermé et vérifié, et la voilà maintenant qui mange les bons choux et refuse qu’on la conduise, et le tout ne me dit rien qui vaille, je ne te le fais pas dire. »</w:t>
+        <w:t xml:space="preserve">« Madame Claus ! » Bram a fait le tour du chalet au trot, en tordant son bonnet entre ses mains. Bram était l’elfe qui était descendu dans le Sud avec nous, le contremaître de l’atelier relocalisé, dévoué, tatillon et bâti selon les proportions générales d’une patate inquiète, et il était au summum de l’angoisse à présent. « C’est Dancer. Elle s’est échappée encore une fois. C’est la troisième fois cette semaine, madame Claus, la troisième. Et je jurerais sur chaque bouton de ma veste que ce loquet était fermé quand je l’ai laissé, fermé et vérifié, et la voilà maintenant qui mange les bons choux et refuse qu’on la conduise, et le tout ne me dit rien qui vaille, je ne te le cache pas. »</w:t>
       </w:r>
     </w:p>
     <w:p/>
@@ -2347,7 +2347,7 @@
     <w:p/>
     <w:p>
       <w:r>
-        <w:t xml:space="preserve">« Vous gardez les registres fonciers, ai-je fait d’un ton léger, comme pour ne pas laisser peser le silence qu’on n’entendait que gratter la plume. Depuis tout ce temps. Ça doit être utile aux gens. Je parie que la moitié de la ville vient vous voir quand elle veut savoir qui a construit sa maison, ou ce qu’est devenu le terrain de sa grand-mère. »</w:t>
+        <w:t xml:space="preserve">« Vous gardez les registres fonciers, ai-je fait d’un ton léger, comme pour meubler un silence que seul troublait le grattement de la plume. Depuis tout ce temps. Ça doit être utile aux gens. Je parie que la moitié de la ville vient vous voir quand elle veut savoir qui a construit sa maison, ou ce qu’est devenu le terrain de sa grand-mère. »</w:t>
       </w:r>
     </w:p>
     <w:p/>
@@ -2413,7 +2413,7 @@
     <w:p/>
     <w:p>
       <w:r>
-        <w:t xml:space="preserve">« C’est la saison, a-t-elle soufflé. Et le maire verse un salaire municipal pour le travail d’une grande ville, et il n’y a jamais tout à fait assez à la fin du mois. Pas pour grand monde cette année. Les factures ne se paient pas toutes seules. » Elle a poussé un petit rire usé qui n’avait rien de drôle. « Les factures de personne ne se paient toutes seules cette année, n’est-ce pas, madame Claus ? »</w:t>
+        <w:t xml:space="preserve">« C’est la saison, a-t-elle soufflé. Et le maire verse un salaire municipal pour le travail d’une grande ville, et il n’y a jamais tout à fait assez à la fin du mois. Pour personne, cette année. Les factures ne se paient pas toutes seules. » Elle a poussé un petit rire usé qui n’avait rien de drôle. « Les factures de personne ne se paient toutes seules cette année, n’est-ce pas, madame Claus ? »</w:t>
       </w:r>
     </w:p>
     <w:p/>
@@ -2507,7 +2507,7 @@
     </w:p>
     <w:p>
       <w:r>
-        <w:t xml:space="preserve">« C’est ce que dit l’arithmétique. » Theo a retiré ses lunettes et s’est massé l’arête du nez, et pendant une seconde sa voix soignée a tremblé. « J’ai fait des demandes partout. Je tiens à ce que vous le sachiez tous. Partout où il y a une subvention, une fondation, un fonds dans trois États. J’ai un dossier rempli de leurs refus. Je pourrais tapisser cette pièce avec, et au moins elle serait sèche. » Quelques-uns ont ri, le rire triste et impuissant de gens au bout de leurs options. « La ville ne veut pas aider. Je suis allé voir le maire moi-même au printemps dernier, et madame Claus ici présente y est retournée ce matin, et il répète la même chose que d’habitude. L’histoire ne déblaie pas les routes. » Il a posé ses lunettes sur ses dossiers. « Je ne sais plus quoi essayer. J’ai essayé d’être raisonnable. J’ai essayé d’apitoyer. Je n’ai pas honte de vous dire que j’ai essayé d’apitoyer, par écrit, une fondation en ville, et ils ont renvoyé une lettre des plus aimables pour dire non. »</w:t>
+        <w:t xml:space="preserve">« C’est ce que dit l’arithmétique. » Theo a retiré ses lunettes et s’est massé l’arête du nez, et pendant une seconde sa voix soignée a tremblé. « J’ai fait des demandes partout. Je tiens à ce que vous le sachiez tous. Partout où il y a une subvention, une fondation, un fonds dans trois États. J’ai un dossier rempli de leurs refus. Je pourrais tapisser cette pièce avec, et au moins elle serait sèche. » Quelques-uns ont ri, le rire triste et impuissant de gens au bout de leurs options. « La ville ne veut pas aider. Je suis allé voir le maire moi-même au printemps dernier, et madame Claus ici présente y est retournée ce matin, et il répète la même chose que d’habitude. L’histoire ne déblaie pas les routes. » Il a posé ses lunettes sur ses dossiers. « Je ne sais plus quoi essayer. J’ai essayé d’être raisonnable. J’ai essayé d’apitoyer. Je n’ai pas honte de vous dire que j’ai essayé d’apitoyer, par écrit, une fondation de la grande ville, et ils ont renvoyé une lettre des plus aimables pour dire non. »</w:t>
       </w:r>
     </w:p>
     <w:p>
@@ -2517,7 +2517,7 @@
     </w:p>
     <w:p>
       <w:r>
-        <w:t xml:space="preserve">Cela aurait été tellement plus simple si Theo avait été un homme mauvais, quelqu’un que j’aurais pu détester sans arrière-pensée. Mais je suis restée assise dans cette pièce glacée et j’ai compris, jusqu’au plus profond de moi, comment Theo Hussein, en assistant à cela, en entendant cela, pouvait ouvrir un dossier de vieilles lettres, y voir non pas un crime vieux d’un siècle mais une bouée de sauvetage, et tendre la main vers elle, se répétant tout du long qu’il agissait pour la Société. Je ne lui ai pas pardonné. Mais j’ai compris, et j’ai porté ce poids, froid et lourd, pendant le reste de la réunion.</w:t>
+        <w:t xml:space="preserve">Cela aurait été tellement plus simple si Theo avait été un homme mauvais, quelqu’un que j’aurais pu détester sans arrière-pensée. Mais je suis restée assise dans cette pièce glacée et j’ai compris, jusqu’au plus profond de moi, comment Theo Hussein, en assistant à cela, en entendant cela, pouvait ouvrir un dossier de vieilles lettres, y voir non pas un crime vieux d’un siècle mais une bouée de sauvetage, et tendre la main vers elle, se répétant tout du long qu’il agissait pour la Société. Je ne l’excusais pas. Mais je le comprenais, et j’ai porté ce poids, froid et lourd, pendant le reste de la réunion.</w:t>
       </w:r>
     </w:p>
     <w:p>
@@ -2761,7 +2761,7 @@
     <w:p/>
     <w:p>
       <w:r>
-        <w:t xml:space="preserve">Une petite foule s’était en effet rassemblée, une foule ravie. Des enfants étaient apparus, comme ils le font dès qu’il y a un renne, et ils grimpaient sur le rebord de la fontaine pour la caresser en poussant des cris aigus. Un homme que je ne connaissais pas photographiait Prancer pour ses petits-enfants, et le vieux M. Kim, de l’atelier mécanique, avait sorti une chaise pliante sur le trottoir pour assister à tout le spectacle avec la satisfaction d’un spectateur assistant à une bonne représentation.</w:t>
+        <w:t xml:space="preserve">Une petite foule s’était en effet rassemblée, une foule ravie. Des enfants étaient apparus, comme ils le font dès qu’il y a un renne, et ils grimpaient sur le rebord de la fontaine pour la caresser en poussant des cris aigus. Un homme que je ne connaissais pas photographiait Prancer pour ses petits-enfants, et le vieux M. Kim, du garage, avait sorti une chaise pliante sur le trottoir pour assister à tout le spectacle avec la satisfaction d’un spectateur assistant à une bonne représentation.</w:t>
       </w:r>
     </w:p>
     <w:p/>
@@ -2827,7 +2827,7 @@
     <w:p/>
     <w:p>
       <w:r>
-        <w:t xml:space="preserve">Je suis rentrée chez moi en suivant les traces de sabots d’un renne, avec Pip à mes côtés. Quoi que fît la magie à présent, elle exerçait une attraction vers un foyer dont personne en ville ne soupçonnait l’existence. C’était cela que Nick avait voulu dire. La magie ignorait comment faire du mal. Elle savait seulement comment rentrer chez elle, et elle avançait chaque jour un peu plus, laissant derrière elle de minuscules impossibilités : la neige dans une boule qui refusait de retomber, un renne rentrant de lui-même à pied vers un foyer qu’elle n’avait jamais vu.</w:t>
+        <w:t xml:space="preserve">Je suis rentrée chez moi en suivant les traces de sabots d’un renne, avec Pip à mes côtés. Quoi que fît la magie à présent, elle exerçait une attraction vers un foyer dont personne en ville ne soupçonnait l’existence. C’était cela que Nick avait voulu dire. La magie ignorait comment faire du mal. Elle savait seulement comment rentrer chez elle, et elle avançait chaque jour un peu plus, laissant derrière elle de minuscules impossibilités : la neige dans une boule qui refusait de retomber, un renne rentrant seul à pied vers un foyer qu’elle n’avait jamais vu.</w:t>
       </w:r>
     </w:p>
     <w:p/>
@@ -3056,7 +3056,7 @@
     </w:p>
     <w:p>
       <w:r>
-        <w:t xml:space="preserve">À l’entendre, Pip a levé le nez de son panier près du poêle, n’a vu aucune sardine à l’horizon et a replongé son bec dans ses plumes.</w:t>
+        <w:t xml:space="preserve">En entendant son nom, Pip a levé le nez de son panier près du poêle, n’a vu aucune sardine à l’horizon et a replongé son bec dans ses plumes.</w:t>
       </w:r>
     </w:p>
     <w:p>
@@ -3081,7 +3081,7 @@
     </w:p>
     <w:p>
       <w:r>
-        <w:t xml:space="preserve">« Il en reste deux. » J’ai regardé la page sans en avoir envie. Vera. Theo. Les deux noms sur lesquels je n’avais aucun trait à passer. « Et c’est cela qui m’inquiète. De tous ceux sur cette page, les deux seuls que je ne peux pas blanchir sont ceux qui détiennent les clés des vieux papiers de la ville. Vera garde les actes et les registres de propriété, un siècle de qui-possède-quoi, l’acte de l’auberge se trouvant quelque part parmi eux. Elle est devenue raide comme un piquet en me disant qu’elle ne lit jamais les papiers mêmes qui se trouvent juste derrière elle. Et Theo. » Je me suis forcée à le dire lentement. « Theo vit dans les archives. Les lettres des Blackburn étaient sous sa responsabilité, entre ses mains. Et les plus intéressantes d’entre elles, celles précisément qui diraient qu’une broche a disparu et où elle est allée, ce sont celles dont il s’est levé devant toute la ville pour annoncer qu’elles s’étaient égarées. »</w:t>
+        <w:t xml:space="preserve">« Il en reste deux. » J’ai regardé la page sans en avoir envie. Vera. Theo. Les deux noms sur lesquels je n’avais aucun trait à passer. « Et c’est cela qui m’inquiète. De tous ceux sur cette page, les deux seuls que je ne peux pas blanchir sont ceux qui détiennent les clés des vieux papiers de la ville. Vera garde les actes et les registres fonciers, un siècle de qui-possède-quoi, l’acte de l’auberge se trouvant quelque part parmi eux. Elle est devenue raide comme un piquet en me disant qu’elle ne lit jamais les papiers mêmes qui se trouvent juste derrière elle. Et Theo. » Je me suis forcée à le dire lentement. « Theo vit dans les archives. Les lettres des Blackburn étaient sous sa responsabilité, entre ses mains. Et les plus intéressantes d’entre elles, celles précisément qui diraient qu’une broche a disparu et où elle est allée, ce sont celles dont il s’est levé devant toute la ville pour annoncer qu’elles s’étaient égarées. »</w:t>
       </w:r>
     </w:p>
     <w:p>
@@ -3111,7 +3111,7 @@
     </w:p>
     <w:p>
       <w:r>
-        <w:t xml:space="preserve">« Bientôt, ai-je dit. Il y a d’abord deux fils à nouer. Sam, et l’étranger. Je veux qu’ils soient tous les deux écartés pour de bon, blanchis au-delà de tout doute, avant de m’autoriser à entrer dans ces archives et à regarder Theo en face. Je lui dois bien ça, de ne pas porter mes soupçons sur lui tant qu’il ne restera personne d’autre à suspecter. Et ensuite j’irai, je regarderai les lettres, et je découvrirai si les mots correspondent. »</w:t>
+        <w:t xml:space="preserve">« Bientôt, ai-je dit. Il y a d’abord deux fils à nouer. Sam, et l’étranger. Je veux qu’ils soient tous les deux écartés pour de bon, blanchis au-delà de tout doute, avant de m’autoriser à entrer dans ces archives et à regarder Theo en face. Je lui dois bien ça, de ne pas porter mes soupçons sur lui avant qu’il ne reste plus personne d’autre à suspecter. Et ensuite j’irai, je regarderai les lettres, et je découvrirai si les mots correspondent. »</w:t>
       </w:r>
     </w:p>
     <w:p>
@@ -3138,7 +3138,7 @@
     <w:p/>
     <w:p>
       <w:r>
-        <w:t xml:space="preserve">Il n’était pas à la forge. Il était à l’auberge, juché sur une échelle sur le porche pour poser les derniers supports en fer, la bouche pleine de vis et un niveau à bulle posé sur la rampe. Il est descendu quand il m’a vue sur le chemin, méfiant. La dernière fois que nous avions parlé, j’avais rôdé autour de lui sans l’avouer, et il l’avait senti, même s’il n’aurait pas su mettre de mots dessus.</w:t>
+        <w:t xml:space="preserve">Il n’était pas à la forge. Il était à l’auberge, juché sur une échelle sur le porche pour poser les dernières consoles en fer, la bouche pleine de vis et un niveau à bulle posé sur la rampe. Il est descendu quand il m’a vue sur le chemin, méfiant. La dernière fois que nous avions parlé, j’avais rôdé autour de lui sans l’avouer, et il l’avait senti, même s’il n’aurait pas su mettre de mots dessus.</w:t>
       </w:r>
     </w:p>
     <w:p/>
@@ -3198,7 +3198,7 @@
     <w:p/>
     <w:p>
       <w:r>
-        <w:t xml:space="preserve">L’odeur sur la note n’avait jamais été celle de Sam. C’était celle de son travail. Un forgeron finit le fer en y brûlant de l’huile pendant qu’il est encore chaud, et la ferronnerie neuve garde cette fumée pendant des semaines. Le hall de Fiona en était plein, la rampe d’escalier, le pare-étincelles, les supports posés sur le porche, et le manteau et le sac à outils de Sam avaient pendu près de sa porte tous les jours pendant trois semaines. Chaque papier posé sur ce bureau avait pris cette odeur. La note s’y trouvait aussi. L’indice qui l’avait mis en haut de ma liste m’avait indiqué tout du long où la note s’était trouvée. Pas qui l’avait écrite. Je l’avais lue à l’envers. Maintenant, je pouvais la lire dans le bon sens, et le bon sens le blanchissait de fond en comble.</w:t>
+        <w:t xml:space="preserve">L’odeur sur la note n’avait jamais été celle de Sam. C’était celle de son travail. Un forgeron finit le fer en y brûlant de l’huile pendant qu’il est encore chaud, et la ferronnerie neuve garde cette fumée pendant des semaines. Le hall de Fiona en était plein, la rampe d’escalier, le pare-étincelles, les consoles posées sur le porche, et le manteau et le sac à outils de Sam avaient pendu près de sa porte tous les jours pendant trois semaines. Chaque papier posé sur ce bureau avait pris cette odeur. La note s’y trouvait aussi. L’indice qui l’avait mis en haut de ma liste m’avait indiqué tout du long où la note s’était trouvée. Pas qui l’avait écrite. Je l’avais lue à l’envers. Maintenant, je pouvais la lire dans le bon sens, et le bon sens le blanchissait de fond en comble.</w:t>
       </w:r>
     </w:p>
     <w:p/>
@@ -3216,7 +3216,7 @@
     <w:p/>
     <w:p>
       <w:r>
-        <w:t xml:space="preserve">J’ai promis que je le ferais, les deux choses, et je l’ai laissé à ses supports. Pip a abandonné les vis à regret, et elle et moi sommes remontées la rue claire et froide. Quelque part entre l’auberge et le coin de la rue, j’ai rayé Sam Patel de la liste dans ma tête, et j’en étais ravie. Un nom de moins. Un brave homme de plus qui, du moment que je l’avais laissé entrer, s’était transformé d’une fissure dans le mur autour de Fiona en une pierre de plus pour le bâtir.</w:t>
+        <w:t xml:space="preserve">J’ai promis que je le ferais, les deux choses, et je l’ai laissé à ses consoles. Pip a abandonné les vis à regret, et elle et moi sommes remontées la rue claire et froide. Quelque part entre l’auberge et le coin de la rue, j’ai rayé Sam Patel de la liste dans ma tête, et j’en étais ravie. Un nom de moins. Un brave homme de plus qui, du moment que je l’avais laissé entrer, s’était transformé d’une fissure dans le mur autour de Fiona en une pierre de plus pour le bâtir.</w:t>
       </w:r>
     </w:p>
     <w:p/>
@@ -3414,7 +3414,7 @@
     </w:p>
     <w:p>
       <w:r>
-        <w:t xml:space="preserve">Je me suis forcée à respirer. Je me suis forcée à reposer les trois fiches au crayon rouge avec les autres et à continuer le tri, B, B, Bridge (tournoi), Banderoles (surplus), comme si le plancher de la pièce ne venait pas de s’entrouvrir discrètement sous ma chaise. De l’autre côté de la pièce, Theo chantonnait, a déplacé une boîte et a dit quelque chose à propos de la chaudière auquel j’ai répondu sans entendre ma propre réponse. L’homme de l’autre côté de la pièce, l’homme le plus gentil de Frost Falls, l’homme qui achetait le bon cacao avec les petits chamallows avec son propre argent pour que les enfants ne grandissent pas sans connaître les histoires de leur ville, avait écrit les mots qui terrorisaient Fiona. Ou bien son soin de ces lettres avait permis à quelqu’un d’autre de les écrire, quelqu’un d’une liste si courte que son nom trônait tout en haut, de sa belle écriture.</w:t>
+        <w:t xml:space="preserve">Je me suis forcée à respirer. Je me suis forcée à reposer les trois fiches au crayon rouge avec les autres et à continuer le tri, B, B, Bridge (tournoi), Banderoles (surplus), comme si le plancher de la pièce ne venait pas de s’entrouvrir discrètement sous ma chaise. De l’autre côté de la pièce, Theo chantonnait, a déplacé une boîte et a dit quelque chose à propos de la chaudière auquel j’ai répondu sans entendre ma propre réponse. L’homme de l’autre côté de la pièce, l’homme le plus gentil de Frost Falls, l’homme qui achetait le bon cacao avec les petits chamallows avec son propre argent pour que les enfants ne grandissent pas sans connaître les histoires de leur ville, avait écrit les notes qui terrorisaient Fiona. Ou bien son soin de ces lettres avait permis à quelqu’un d’autre de les écrire, quelqu’un d’une liste si courte que son nom trônait tout en haut, de sa belle écriture.</w:t>
       </w:r>
     </w:p>
     <w:p>
@@ -3429,7 +3429,7 @@
     </w:p>
     <w:p>
       <w:r>
-        <w:t xml:space="preserve">Je ne me souviens pas de la marche du chemin du retour. Je me souviens de Pip serrée contre moi tout du long, se frottant à ma cheville un pas sur deux, comme elle le faisait lorsqu’elle sentait que quelque chose n’allait pas.</w:t>
+        <w:t xml:space="preserve">Je ne me souviens pas du chemin du retour. Je me souviens de Pip serrée contre moi tout du long, se frottant à ma cheville un pas sur deux, comme elle le faisait lorsqu’elle sentait que quelque chose n’allait pas.</w:t>
       </w:r>
     </w:p>
     <w:p>
@@ -3746,7 +3746,7 @@
     </w:p>
     <w:p>
       <w:r>
-        <w:t xml:space="preserve">« Ah bon. » Elle a bu une gorgée de son jus de pomme. Elle ne me regardait pas. Elle observait la foule, comme je le faisais tout l’après-midi. « Sam Patel a pensé la même chose. Ça fait deux d’entre vous à surveiller la réception de Fiona. Il y a quelque chose que je devrais savoir, madame Claus ? »</w:t>
+        <w:t xml:space="preserve">« Ah bon. » Elle a bu une gorgée de son jus de pomme. Elle ne me regardait pas. Elle observait la foule, comme je le faisais tout l’après-midi. « Sam Patel a pensé la même chose. Vous êtes donc deux à surveiller la réception de Fiona. Il y a quelque chose que je devrais savoir, madame Claus ? »</w:t>
       </w:r>
     </w:p>
     <w:p>
@@ -3776,7 +3776,7 @@
     </w:p>
     <w:p>
       <w:r>
-        <w:t xml:space="preserve">Je me tenais au milieu de la neige qui tombait parmi mes voisins, Pip blottie contre ma botte, la main gantée d’Emma trouvant la mienne d’un côté et celle de Fiona de l’autre. J’ai embrassé tout cela du regard, les lanternes, la neige, la lumière dorée, la centaine de visages tournés vers le ciel, et j’ai compris, de cette certitude viscérale qui précède la compréhension de l’esprit, exactement ce qui était en jeu. Pas un bâtiment. Pas même un secret. Ça. Ce rassemblement, cette ville donnant le meilleur d’elle-même par une journée froide et lumineuse. Un homme avait tendu la main depuis l’obscurité pour rançonner une part de tout cela, pour en faire une arme et une source de peur. Debout là dans la neige, mon esprit est devenu aussi dur et clair que le froid. Quoi que cela dût me coûter, je ne le laisserais pas garder son emprise là-dessus. Je le ramènerais dans la lumière, dans une journée semblable à celle-ci, où les choses pouvaient guérir.</w:t>
+        <w:t xml:space="preserve">Je me tenais au milieu de la neige qui tombait parmi mes voisins, Pip blottie contre ma botte, la petite main d’Emma, dans sa moufle, trouvant la mienne d’un côté et celle de Fiona de l’autre. J’ai embrassé tout cela du regard, les lanternes, la neige, la lumière dorée, la centaine de visages tournés vers le ciel, et j’ai compris, de cette certitude viscérale qui précède la compréhension de l’esprit, exactement ce qui était en jeu. Pas un bâtiment. Pas même un secret. Ça. Ce rassemblement, cette ville donnant le meilleur d’elle-même par une journée froide et lumineuse. Un homme avait tendu la main depuis l’obscurité pour rançonner une part de tout cela, pour en faire une arme et une source de peur. Debout là dans la neige, mon esprit est devenu aussi dur et clair que le froid. Quoi que cela dût me coûter, je ne le laisserais pas garder son emprise là-dessus. Je le ramènerais dans la lumière, dans une journée semblable à celle-ci, où les choses pouvaient guérir.</w:t>
       </w:r>
     </w:p>
     <w:p>
@@ -4050,7 +4050,7 @@
     <w:p/>
     <w:p>
       <w:r>
-        <w:t xml:space="preserve">Cela se présentait ainsi. Je savais qui. Je savais comment. J’en détenais la preuve : la fiche de catalogue, le papier assorti tenu à la lampe, le titre de propriété de l’auberge posé hors de son tiroir. Je pouvais donc aller trouver Theo et Vera en toute discrétion, rien qu’à trois, sans personne d’autre au monde, et leur dire : Je sais. Arrêtez maintenant, et cela s’arrête ici, ce soir, sans que personne d’autre ne se doute de rien. Plus jamais. Et ils l’auraient fait, car c’étaient des âmes effrayées et non des criminels endurcis. Ils auraient pleuré de soulagement d’être épargnés. Les notes cesseraient, et Fiona serait en sécurité. Le secret retournerait dans son coffre au grenier. Theo garderait sa Société et sa bonne réputation, et Vera son poste. La ville n’aurait jamais à apprendre que deux de ses enfants avaient mal tourné pour une simple saison difficile. Tous ceux que j’aimais seraient épargnés par ce chagrin.</w:t>
+        <w:t xml:space="preserve">Cela se présentait ainsi. Je savais qui. Je savais comment. J’en détenais la preuve : la fiche de catalogue, le papier assorti tenu à la lampe, l’acte de propriété de l’auberge posé hors de son tiroir. Je pouvais donc aller trouver Theo et Vera en toute discrétion, rien qu’à trois, sans personne d’autre au monde, et leur dire : Je sais. Arrêtez maintenant, et cela s’arrête ici, ce soir, sans que personne d’autre ne se doute de rien. Plus jamais. Et ils l’auraient fait, car c’étaient des âmes effrayées et non des criminels endurcis. Ils auraient pleuré de soulagement d’être épargnés. Les notes cesseraient, et Fiona serait en sécurité. Le secret retournerait dans son coffre au grenier. Theo garderait sa Société et sa bonne réputation, et Vera son poste. La ville n’aurait jamais à apprendre que deux de ses enfants avaient mal tourné pour une simple saison difficile. Tous ceux que j’aimais seraient épargnés par ce chagrin.</w:t>
       </w:r>
     </w:p>
     <w:p/>
@@ -4134,7 +4134,7 @@
     <w:p/>
     <w:p>
       <w:r>
-        <w:t xml:space="preserve">« J’en suis sûre, ai-je dit. La lumière, pas l’ombre. Mais avec douceur, Nick. Avec toute la clémence dont la vérité est capable. Le crime doit s’exposer au grand jour, mais nul ne doit être brisé plus qu’il n’est inévitable. Il est possible de rendre la justice tout en gardant un cœur chaleureux. C’est une nécessité. J’entends bien y parvenir. »</w:t>
+        <w:t xml:space="preserve">« J’en suis sûre, ai-je dit. La lumière, pas l’ombre. Mais avec douceur, Nick. Avec toute la clémence dont la vérité est capable. Le crime doit s’exposer au grand jour, mais nul ne doit être brisé plus qu’il n’est inévitable. Il est possible de rendre la justice tout en gardant un cœur chaleureux. Il faut que ce soit possible. J’entends bien y parvenir. »</w:t>
       </w:r>
     </w:p>
     <w:p/>
@@ -4146,7 +4146,7 @@
     <w:p/>
     <w:p>
       <w:r>
-        <w:t xml:space="preserve">J’ai serré sa main près du feu durant de longues minutes. Dehors, les guirlandes de fêtes projetaient une lueur dorée sur la ville endormie, cette communauté têtue et indulgente que j’étais venue à chérir, et j’allais lui faire du mal à dessein pour qu’elle puisse cicatriser. J’avais fait le choix qui n’appartenait qu’à moi seule.</w:t>
+        <w:t xml:space="preserve">J’ai serré sa main près du feu durant de longues minutes. Dehors, les guirlandes du festival projetaient une lueur dorée sur la ville endormie, cette communauté têtue et indulgente que j’étais venue à chérir, et j’allais lui faire du mal à dessein pour qu’elle puisse cicatriser. J’avais fait le choix qui n’appartenait qu’à moi seule.</w:t>
       </w:r>
     </w:p>
     <w:p>
@@ -4294,7 +4294,7 @@
     <w:p/>
     <w:p>
       <w:r>
-        <w:t xml:space="preserve">Nous l’avons fait le dernier après-midi du festival, dans le petit salon de Fiona, alors que les bruits de la foire qui se terminait flottaient à travers la fenêtre, la plainte d’un enfant qui ne voulait pas rentrer, le grincement des tables pliantes qu’on rangeait dans le parc. Noriko avait demandé à Theo de venir discuter de ce qu’elle avait qualifié d’affaire de la Société, et avait demandé à Vera de venir pour ce qu’elle avait appelé une course pour le bureau du maire. Les deux sont donc arrivés à quelques minutes d’intervalle, séparément, sans savoir l’un et l’autre qu’ils venaient.</w:t>
+        <w:t xml:space="preserve">Nous l’avons fait le dernier après-midi du festival, dans le petit salon de Fiona, alors que les bruits de la foire qui se terminait flottaient à travers la fenêtre, la plainte d’un enfant qui ne voulait pas rentrer, le grincement des tables pliantes qu’on rangeait dans le parc. Noriko avait demandé à Theo de venir discuter de ce qu’elle avait qualifié d’affaire de la Société, et avait demandé à Vera de venir pour ce qu’elle avait appelé une course pour le bureau du maire. Les deux sont donc arrivés à quelques minutes d’intervalle, séparément, sans que l’un sache que l’autre venait aussi.</w:t>
       </w:r>
     </w:p>
     <w:p/>
@@ -4330,7 +4330,7 @@
     <w:p/>
     <w:p>
       <w:r>
-        <w:t xml:space="preserve">« Theo, ai-je dit. Les notes de chantage envoyées à Fiona ont été écrites sur le papier à en-tête de la Société. Le papier vergé épais aux vergures marquées. Je l’ai comparé grain à grain avec une feuille de ton stock. » Il a tressailli, mais j’ai continué, d’une voix assurée. « Et elles décrivent la broche comme </w:t>
+        <w:t xml:space="preserve">« Theo, ai-je dit. Les notes de chantage envoyées à Fiona ont été écrites sur le papier à en-tête de la Société. Le papier vergé épais, couleur crème. Je l’ai comparé grain à grain avec une feuille de ton stock. » Il a tressailli, mais j’ai continué, d’une voix assurée. « Et elles décrivent la broche comme </w:t>
       </w:r>
       <w:r>
         <w:rPr>
@@ -4387,7 +4387,7 @@
     <w:p/>
     <w:p>
       <w:r>
-        <w:t xml:space="preserve">La pièce est devenue silencieuse après cela, hormis les pleurs et les bruits lointains du festival qu’on pliait au-dehors. Deux personnes qui avaient commis un acte cruel pour des raisons qu’elles avaient parées de belles paroles au point de ne plus voir ce qui se cachait dessous, assises à présent dans les décombres de tout cela, l’assumant enfin, à voix haute. Aucun piège ne s’était refermé. Personne n’avait surgi des ténèbres. Nous avions tout exposé de manière entière et claire dans une pièce chaude à la lumière de l’après-midi, en leur donnant la chance d’être honnêtes. Elles l’avaient saisie, parce qu’en fin de compte, tout comme Noriko l’avait dit, la plupart des gens sont fatigués à mourir de porter ce fardeau.</w:t>
+        <w:t xml:space="preserve">La pièce est devenue silencieuse après cela, hormis les pleurs et les bruits lointains du festival qu’on pliait au-dehors. Deux personnes qui avaient commis un acte cruel pour des raisons qu’elles avaient parées de belles paroles au point de ne plus voir ce qui se cachait dessous, assises à présent dans les décombres de tout cela, l’assumant enfin, à voix haute. Aucun piège ne s’était refermé. Personne n’avait surgi des ténèbres. Nous avions tout exposé de manière entière et claire dans une pièce chaude à la lumière de l’après-midi, en leur donnant la chance d’être honnêtes. Ils l’avaient saisie, parce qu’en fin de compte, tout comme Noriko l’avait dit, la plupart des gens sont fatigués à mourir de porter ce fardeau.</w:t>
       </w:r>
     </w:p>
     <w:p/>
@@ -4452,7 +4452,7 @@
     <w:p/>
     <w:p>
       <w:r>
-        <w:t xml:space="preserve">Il a démissionné. Pas pour un temps, pour être replacé discrètement dans son fauteuil une fois que la ville aurait fini d’être en colère. Il a démissionné de la présidence de la Société historique de Frost Falls, et le conseil d’administration, une fois qu’il a tout su, a accepté cette démission sans ambiguïté. On ne pouvait pas faire chanter un voisin en utilisant la collection et le papier à en-tête de la Société, puis conserver les clés de l’endroit.</w:t>
+        <w:t xml:space="preserve">Il a démissionné. Pas pour un temps, pour être replacé discrètement dans son fauteuil une fois que la ville aurait fini d’être en colère. Il a démissionné de la présidence de la Société historique de Frost Falls, et le conseil d’administration, une fois qu’il a tout su, a accepté cette démission sans ambiguïté. On ne pouvait pas faire chanter une voisine en utilisant la collection et le papier à en-tête de la Société, puis conserver les clés de l’endroit.</w:t>
       </w:r>
     </w:p>
     <w:p/>
@@ -4470,7 +4470,7 @@
     <w:p/>
     <w:p>
       <w:r>
-        <w:t xml:space="preserve">« C’est exactement ce que tu mérites, lui a dit Fiona, et il y avait de l’acier tendu à travers sa gentillesse. C’est-à-dire une chance de devenir un homme qui n’aurait jamais fait une chose pareille au départ. Tu n’as pas droit à la version facile, Theo, celle où tout le monde te prend dans ses bras et où tout est oublié à Noël. Tu as droit à la vraie. Tu dois la regagner, pendant des années, et en ressentir chaque année. Je ne suis pas cruelle avec toi. Je crois que tu en es capable. Je ne prendrais pas la peine de te construire une route si je pensais que tu ne pouvais pas la marcher. »</w:t>
+        <w:t xml:space="preserve">« C’est exactement ce que tu mérites, lui a dit Fiona, et il y avait de l’acier tendu à travers sa gentillesse. C’est-à-dire une chance de devenir un homme qui n’aurait jamais fait une chose pareille au départ. Tu n’as pas droit à la version facile, Theo, celle où tout le monde te prend dans ses bras et où tout est oublié à Noël. Tu as droit à la vraie. Tu dois la regagner, pendant des années, et en ressentir chaque année. Je ne suis pas cruelle avec toi. Je crois que tu en es capable. Je ne prendrais pas la peine de te construire une route si je pensais que tu ne pouvais pas la parcourir. »</w:t>
       </w:r>
     </w:p>
     <w:p/>
@@ -4494,7 +4494,7 @@
     <w:p/>
     <w:p>
       <w:r>
-        <w:t xml:space="preserve">Elle a pleuré. Elle m’a serrée dans ses bras, cette femme raide et coincée dont je n’avais jamais vu qu’elle serre qui que ce soit contre elle, et a murmuré merci contre mon épaule. Puis elle est repartie en voiture vers chez sa sœur, et Pip et moi sommes rentrées à pied dans la pénombre tombante. Il n’y avait aucun triomphe là-dedans. J’étais lourde et fatiguée jusqu’aux os, comme si j’avais nettoyé une blessure jusqu’au fond : cela faisait infiniment plus mal que de n’y pas toucher, mais maintenant elle pouvait guérir.</w:t>
+        <w:t xml:space="preserve">Elle a pleuré. Elle m’a serrée dans ses bras, cette femme raide et boutonnée dont je n’avais jamais vu qu’elle serre qui que ce soit contre elle, et a murmuré merci contre mon épaule. Puis elle est repartie en voiture vers chez sa sœur, et Pip et moi sommes rentrées à pied dans la pénombre tombante. Il n’y avait aucun triomphe là-dedans. J’étais lourde et fatiguée jusqu’aux os, comme si j’avais nettoyé une blessure jusqu’au fond : cela faisait infiniment plus mal que de n’y pas toucher, mais maintenant elle pouvait guérir.</w:t>
       </w:r>
     </w:p>
     <w:p/>
@@ -4588,7 +4588,7 @@
     </w:p>
     <w:p>
       <w:r>
-        <w:t xml:space="preserve">Cela ne ressemblait pas à une victoire, de rentrer chez moi à pied. Venais-je de dissuader un homme bon de régler le seul problème concret à l’origine de toute cette triste histoire ? Durant quelques blocs glacés de ce trajet, je me suis demandé si j’avais été sage ou simplement têtue, si j’avais laissé passer un vrai bien au nom d’un principe qui n’empêcherait pas une seule goutte de pluie de tomber dans l’arrière-salle.</w:t>
+        <w:t xml:space="preserve">Cela ne ressemblait pas à une victoire, de rentrer chez moi à pied. Je venais de dissuader un homme bon de régler le seul problème concret à l’origine de toute cette triste histoire, et durant quelques pâtés de maisons glacés de ce trajet, je me suis demandé si j’avais été sage ou simplement têtue, si j’avais laissé passer un vrai bien au nom d’un principe qui n’empêcherait pas une seule goutte de pluie de tomber dans l’arrière-salle.</w:t>
       </w:r>
     </w:p>
     <w:p>
@@ -4598,7 +4598,7 @@
     </w:p>
     <w:p>
       <w:r>
-        <w:t xml:space="preserve">Les comptes étaient réglés. La guérison des gens d’ici avait commencé. Mais la Société était toujours suspendue à un fil, et nous allions découvrir de quel bois Frost Falls se chauffait quand les enjeux seraient réels.</w:t>
+        <w:t xml:space="preserve">Les comptes étaient réglés. La guérison des personnes concernées avait commencé. Mais la Société était toujours suspendue à un fil, et nous allions découvrir de quoi Frost Falls était capable quand les enjeux seraient réels.</w:t>
       </w:r>
     </w:p>
     <w:p>
@@ -4661,7 +4661,7 @@
     <w:p/>
     <w:p>
       <w:r>
-        <w:t xml:space="preserve">Claire l’a écrit avec bienveillance, parce que Claire était bienveillante, et parce que la vérité s’est avérée bienveillante dès lors qu’on la racontait tout entière au lieu d’en garder seulement la pire moitié. L’article est paru un jeudi, sur toute la première page de la section intérieure. Bien sûr, les gens ont parlé. Ils auraient parlé de la pluie et du beau temps si rien d’autre n’avait été disponible. Mais ils n’ont pas parlé comme Fiona avait passé toute sa vie à redouter qu’ils le fassent. Personne n’a reculé d’horreur. Personne ne l’a regardée de travers par-dessus le comptoir de la boulangerie. Surtout, ils ont intégré cela à tout ce qu’ils savaient de leurs propres ancêtres, qui avaient lutté, commis des erreurs et enduré. La moitié d’entre eux avait une arrière-grand-mère qui avait fait un geste discret et désespéré par un hiver rigoureux, autrefois.</w:t>
+        <w:t xml:space="preserve">Claire l’a écrit avec bienveillance, parce que Claire était bienveillante, et parce que la vérité s’est avérée bienveillante dès lors qu’on la racontait tout entière au lieu d’en garder seulement la pire moitié. L’article est paru un jeudi, sur toute la première page de la section intérieure. Bien sûr, les gens ont parlé. Ils auraient parlé de la pluie et du beau temps si rien d’autre n’avait été disponible. Mais ils n’ont pas parlé comme Fiona avait passé toute sa vie à redouter qu’ils le fassent. Personne n’a reculé d’horreur. Personne ne l’a regardée de travers par-dessus le comptoir de la boulangerie. Pour l’essentiel, ils ont intégré cela à tout ce qu’ils savaient de leurs propres ancêtres, qui avaient lutté, commis des erreurs et enduré. La moitié d’entre eux avait une arrière-grand-mère qui avait fait un geste discret et désespéré par un hiver rigoureux, autrefois.</w:t>
       </w:r>
     </w:p>
     <w:p/>
@@ -4691,7 +4691,7 @@
     <w:p/>
     <w:p>
       <w:r>
-        <w:t xml:space="preserve">Je m’étais préparée à devenir l’étrangère qui avait brisé un homme intègre. J’étais persuadée à plus de moitié que la ville se refroidirait à mon égard, qu’elle regretterait que je n’aie pas laissé les choses en l’état, qu’elle se rappellerait, chaque fois qu’elle me croiserait, que j’étais celle qui avait tiré Theo Hussein en pleine lumière et plongé l’endroit dans le chagrin. Et il y a eu un peu de cela, çà et là, pendant un temps. Quelques personnes qui ne pouvaient pas tout à fait croiser mon regard, qui prenaient un air un peu taciturne quand je poussais la porte d’un magasin. Je l’ai compris et j’ai laissé couler. Je n’ai rien forcé.</w:t>
+        <w:t xml:space="preserve">Je m’étais préparée à devenir l’étrangère qui avait brisé un homme intègre. J’étais plus qu’à moitié persuadée que la ville se refroidirait à mon égard, qu’elle regretterait que je n’aie pas laissé les choses en l’état, qu’elle se rappellerait, chaque fois qu’elle me croiserait, que j’étais celle qui avait tiré Theo Hussein en pleine lumière et plongé l’endroit dans le chagrin. Et il y a eu un peu de cela, çà et là, pendant un temps. Quelques personnes qui ne pouvaient pas tout à fait croiser mon regard, qui prenaient un air un peu taciturne quand je poussais la porte d’un magasin. Je l’ai compris et j’ai laissé couler. Je n’ai rien forcé.</w:t>
       </w:r>
     </w:p>
     <w:p/>
@@ -4732,7 +4732,7 @@
     <w:p/>
     <w:p>
       <w:r>
-        <w:t xml:space="preserve">Theo avait rendu les lettres des Blackburn, absolument toutes, dans le cadre de sa rédemption, et je les reclassais avec Olivia et Dot par un bel après-midi froid, toutes les trois autour de la grande table de travail avec la bonne lampe rapprochée, quand je suis tombée sur une que je n’avais jamais vue. Elle ne parlait pas de la broche. Elle décrivait une journée d’hiver en 1924 où les familles de la ville s’étaient rassemblées dans le parc, avaient scellé un coffret contenant les trésors de la commune et l’avaient enterré sous le grand orme, </w:t>
+        <w:t xml:space="preserve">Theo avait rendu les lettres des Blackburn, absolument toutes, dans le cadre de sa rédemption, et je les reclassais avec Olivia et Dot par un après-midi froid, toutes les trois autour de la grande table de travail avec la bonne lampe rapprochée, quand je suis tombée sur une que je n’avais jamais vue. Elle ne parlait pas de la broche. Elle décrivait une journée d’hiver en 1924 où les familles de la ville s’étaient rassemblées dans le parc, avaient scellé un coffret contenant les trésors de la commune et l’avaient enterré sous le grand orme, </w:t>
       </w:r>
       <w:r>
         <w:rPr>
@@ -4869,7 +4869,7 @@
     <w:p/>
     <w:p>
       <w:r>
-        <w:t xml:space="preserve">J’ai raccompagné Emma et Snowball chez eux un soir de cette semaine-là, avec Pip qui marchait en se dandinant devant nous et Mark à mes côtés. Emma a parlé tout du long, comme elle le faisait désormais, de la boîte en cuivre et de ce qui pouvait bien se trouver à l’intérieur. Des pièces, pensait-elle. Ou une lettre. Ou un trésor, un vrai trésor, de l’or, espérait-elle, et est-ce que toute la ville aurait le droit de regarder, et est-ce qu’elle pourrait être tout devant quand ils l’ouvriraient, parce qu’elle avait été juste là quand elle était sortie de terre et que ça devait bien compter pour quelque chose, non ?</w:t>
+        <w:t xml:space="preserve">J’ai raccompagné Emma et Snowball chez eux un soir de cette semaine-là, avec Pip qui marchait en se dandinant devant nous et Mark à mes côtés. Emma a parlé tout du long, comme elle le faisait désormais, du coffret en cuivre et de ce qui pouvait bien se trouver à l’intérieur. Des pièces, pensait-elle. Ou une lettre. Ou un trésor, un vrai trésor, de l’or, espérait-elle, et est-ce que toute la ville aurait le droit de regarder, et est-ce qu’elle pourrait être tout devant quand ils l’ouvriraient, parce qu’elle avait été juste là quand elle était sortie de terre et que ça devait bien compter pour quelque chose, non ?</w:t>
       </w:r>
     </w:p>
     <w:p/>
@@ -5001,13 +5001,13 @@
     <w:p/>
     <w:p>
       <w:r>
-        <w:t xml:space="preserve">Je me suis blottie contre lui et j’ai regardé l’or accomplir ses lents cercles au-dessus de la grille, et j’ai pensé à l’hiver qui s’annonçait. La Société toujours sur le fil, à sauver comme il se doit ou pas du tout, toute une saison de ventes de pâtisseries et de petite générosité têtue qui nous attendait avant que quiconque ne sache. La boîte en cuivre scellée dans la pièce principale de la Société jusqu’au nouvel an. Vera et Theo arpentant tous deux leurs longs chemins de retour, centimètre par centimètre, dans l’effort. La magie, qui s’apaisait à présent sans l’être tout à fait, étincelant encore aux lumières et aux loquets dans toute la ville. Tant de choses inachevées. Tant de choses restant à faire.</w:t>
-      </w:r>
-    </w:p>
-    <w:p/>
-    <w:p>
-      <w:r>
-        <w:t xml:space="preserve">Mais les lumières étaient dorées au-dessus de Frost Falls. Une enfant qui s’était tue rediscutait de trésors. Fiona s’était enfin redressée au cœur de sa propre histoire, et Theo s’était vu tendre une voie de retour. Je n’étais plus une étrangère ici. J’étais chez moi. Nous étions chez nous tous les deux. Et la magie de Noël, qui nous avait suivis tout du long depuis le Pôle, avait commencé, tout juste commencé, à s’installer.</w:t>
+        <w:t xml:space="preserve">Je me suis blottie contre lui et j’ai regardé l’or accomplir ses lents cercles au-dessus de la grille, et j’ai pensé à l’hiver qui s’annonçait. La Société toujours sur le fil, à sauver comme il se doit ou pas du tout, toute une saison de ventes de pâtisseries et de petite générosité têtue qui nous attendait avant que quiconque ne sache. Le coffret en cuivre scellé dans la pièce principale de la Société jusqu’au nouvel an. Vera et Theo arpentant tous deux leurs longs chemins de retour, centimètre par centimètre, dans l’effort. La magie, qui s’apaisait à présent sans l’être tout à fait, étincelant encore aux lumières et aux loquets dans toute la ville. Tant de choses inachevées. Tant de choses restant à faire.</w:t>
+      </w:r>
+    </w:p>
+    <w:p/>
+    <w:p>
+      <w:r>
+        <w:t xml:space="preserve">Mais les lumières étaient dorées au-dessus de Frost Falls. Une enfant qui s’était tue bavardait de nouveau de trésors. Fiona s’était enfin redressée au cœur de sa propre histoire, et Theo s’était vu tendre une voie de retour. Je n’étais plus une étrangère ici. J’étais chez moi. Nous étions chez nous tous les deux. Et la magie de Noël, qui nous avait suivis tout du long depuis le Pôle, avait commencé, tout juste commencé, à s’installer.</w:t>
       </w:r>
     </w:p>
     <w:p/>
@@ -5154,7 +5154,7 @@
     <w:p/>
     <w:p>
       <w:r>
-        <w:t xml:space="preserve">La neige était tombée dans la nuit. Pas la neige précoce d’octobre, disparue aussi sec dans une suite de journées douces. De la vraie neige. Celle de la pleine saison, qui avait commencé à Halloween et tiendrait jusqu’au printemps. Elle recouvrait désormais Evergreen Avenue d’une bonne épaisseur bien propre de quinze centimètres, crissant sous les pas de quiconque entrait en s’essuyant les bottes. Durant le week-end, les boutiques avaient troqué leurs squelettes et leurs citrouilles d’Halloween pour des tiges de maïs et des dindes en papier, même si les simples courges étaient restées sur les perrons, parfaites jusqu’à Thanksgiving. L’avenue s’était tue après Halloween, dans l’accalmie précédant la longue et éclatante ruée vers Noël.</w:t>
+        <w:t xml:space="preserve">La neige était tombée dans la nuit. Pas la neige précoce d’octobre, disparue aussi sec dans une suite de journées douces. De la vraie neige. Celle de la pleine saison, qui avait commencé à Halloween et tiendrait jusqu’au printemps. Elle recouvrait désormais Evergreen Avenue d’une bonne épaisseur bien propre de quinze centimètres, crissant sous les pas de quiconque entrait en s’essuyant les bottes. Durant le week-end, les boutiques avaient troqué leurs squelettes et leurs citrouilles d’Halloween pour des tiges de maïs et des dindes en papier, même si les citrouilles ordinaires étaient restées sur les perrons, parfaites jusqu’à Thanksgiving. L’avenue s’était tue après Halloween, dans l’accalmie précédant la longue et éclatante ruée vers Noël.</w:t>
       </w:r>
     </w:p>
     <w:p/>
@@ -5388,7 +5388,7 @@
     <w:p/>
     <w:p>
       <w:r>
-        <w:t>Ce matin, celui du milieu avait fait un pivot complet.</w:t>
+        <w:t xml:space="preserve">Ce matin, celui du milieu avait fait demi-tour.</w:t>
       </w:r>
     </w:p>
     <w:p/>
@@ -5406,7 +5406,7 @@
     <w:p/>
     <w:p>
       <w:r>
-        <w:t xml:space="preserve">« L’idée d’une blague de quelqu’un, a décrété Dot. Il l’a fait pivoter dans la nuit. Des gamins. »</w:t>
+        <w:t xml:space="preserve">« L’idée de quelqu’un qui veut faire une blague, a décrété Dot. Il l’a fait pivoter dans la nuit. Des gamins. »</w:t>
       </w:r>
     </w:p>
     <w:p/>

</xml_diff>